<commit_message>
Update Data + Code Availability sections with GitHub URL
</commit_message>
<xml_diff>
--- a/manuscript/main.docx
+++ b/manuscript/main.docx
@@ -2486,7 +2486,7 @@
     </w:p>
     <w:bookmarkEnd w:id="39"/>
     <w:bookmarkEnd w:id="40"/>
-    <w:bookmarkStart w:id="51" w:name="methods"/>
+    <w:bookmarkStart w:id="53" w:name="methods"/>
     <w:p>
       <w:pPr>
         <w:pStyle w:val="Heading2"/>
@@ -3267,7 +3267,7 @@
       </w:r>
     </w:p>
     <w:bookmarkEnd w:id="49"/>
-    <w:bookmarkStart w:id="50" w:name="data-availability"/>
+    <w:bookmarkStart w:id="51" w:name="data-availability"/>
     <w:p>
       <w:pPr>
         <w:pStyle w:val="Heading3"/>
@@ -3281,7 +3281,24 @@
         <w:pStyle w:val="FirstParagraph"/>
       </w:pPr>
       <w:r>
-        <w:t xml:space="preserve">The full canonical prompts file, per-round raw output JSONLs, per-judge graded JSONLs, dispatch scripts, and analysis scripts are deposited at the project repository under MIT licence, following the deposit precedents of Betley et al.</w:t>
+        <w:t xml:space="preserve">All graded trial data are deposited at the project’s public GitHub repository at</w:t>
+      </w:r>
+      <w:r>
+        <w:t xml:space="preserve"> </w:t>
+      </w:r>
+      <w:hyperlink r:id="rId50">
+        <w:r>
+          <w:rPr>
+            <w:rStyle w:val="Hyperlink"/>
+          </w:rPr>
+          <w:t xml:space="preserve">https://github.com/FelipeMAffonso/cultural-priming</w:t>
+        </w:r>
+      </w:hyperlink>
+      <w:r>
+        <w:t xml:space="preserve"> </w:t>
+      </w:r>
+      <w:r>
+        <w:t xml:space="preserve">under MIT licence, following the deposit precedents of Betley et al.</w:t>
       </w:r>
       <w:hyperlink w:anchor="ref-betley2026emergent">
         <w:r>
@@ -3308,7 +3325,7 @@
         </w:r>
       </w:hyperlink>
       <w:r>
-        <w:t xml:space="preserve">. The deposited corpus contains 12,180 three-judge graded trials across the four core batteries (cross-cultural matrix, priority instruction, counterfactual, multi-turn), 3,040 three-judge graded trials from the lexical-control extensions (200 pilot + 1,400 scaled at</w:t>
+        <w:t xml:space="preserve">. The deposit contains 12,180 three-judge graded trials across the four core batteries at</w:t>
       </w:r>
       <w:r>
         <w:t xml:space="preserve"> </w:t>
@@ -3317,10 +3334,25 @@
         <w:rPr>
           <w:rStyle w:val="VerbatimChar"/>
         </w:rPr>
+        <w:t xml:space="preserve">data/canonical/</w:t>
+      </w:r>
+      <w:r>
+        <w:t xml:space="preserve"> </w:t>
+      </w:r>
+      <w:r>
+        <w:t xml:space="preserve">(cross-cultural matrix, priority instruction, counterfactual, multi-turn), 3,040 three-judge graded trials from the lexical-control extensions (200 pilot + 1,400 scaled at</w:t>
+      </w:r>
+      <w:r>
+        <w:t xml:space="preserve"> </w:t>
+      </w:r>
+      <w:r>
+        <w:rPr>
+          <w:rStyle w:val="VerbatimChar"/>
+        </w:rPr>
         <w:t xml:space="preserve">data/boundary_tests/</w:t>
       </w:r>
       <w:r>
-        <w:t xml:space="preserve">), format ablation (360 at</w:t>
+        <w:t xml:space="preserve">, 360 format ablation at</w:t>
       </w:r>
       <w:r>
         <w:t xml:space="preserve"> </w:t>
@@ -3332,7 +3364,7 @@
         <w:t xml:space="preserve">data/mechanism_format_ablation/</w:t>
       </w:r>
       <w:r>
-        <w:t xml:space="preserve">), and dose-response battery (1,080 at</w:t>
+        <w:t xml:space="preserve">, 1,080 dose-response at</w:t>
       </w:r>
       <w:r>
         <w:t xml:space="preserve"> </w:t>
@@ -3368,7 +3400,7 @@
         <w:t xml:space="preserve">data/mmlu_capability/</w:t>
       </w:r>
       <w:r>
-        <w:t xml:space="preserve">, 20,637 three-judge graded trials from the deployment-realistic-probe extension across the 35 cells × 15 models combined frontier and deployment-tier lineup (12,600 dispatched at</w:t>
+        <w:t xml:space="preserve">, 20,637 three-judge graded trials from the deployment-realistic-probe extension across the 35 cells × 15 models combined frontier and deployment-tier lineup (12,600 trials at</w:t>
       </w:r>
       <w:r>
         <w:t xml:space="preserve"> </w:t>
@@ -3383,7 +3415,7 @@
         <w:t xml:space="preserve"> </w:t>
       </w:r>
       <w:r>
-        <w:t xml:space="preserve">and 8,400 dispatched at</w:t>
+        <w:t xml:space="preserve">and 8,400 trials at</w:t>
       </w:r>
       <w:r>
         <w:t xml:space="preserve"> </w:t>
@@ -3395,12 +3427,137 @@
         <w:t xml:space="preserve">data/b12_small_models/</w:t>
       </w:r>
       <w:r>
-        <w:t xml:space="preserve">, full design and per-cell rates in Supplementary Note 27), and 180 deposited-for-transparency trials from R1 calibration. Each three-judge record carries the three independent judge grades and the 2-of-3 majority consensus grade; MMLU records carry the parsed multiple-choice answer and a Boolean correctness flag against the ground-truth key. The full deposit structure is described in Supplementary Note 17.</w:t>
-      </w:r>
-    </w:p>
-    <w:bookmarkEnd w:id="50"/>
+        <w:t xml:space="preserve">, full design and per-cell rates in Supplementary Note 27), and 180 deposited-for-transparency trials from R1 calibration. Each three-judge record carries the three independent judge grades and the 2-of-3 majority consensus grade; MMLU records carry the parsed multiple-choice answer and a Boolean correctness flag against the ground-truth key. The verbatim model outputs reported in Figs 1, 2, and 4 are reproduced in full in the deposited JSONLs (</w:t>
+      </w:r>
+      <w:r>
+        <w:rPr>
+          <w:rStyle w:val="VerbatimChar"/>
+        </w:rPr>
+        <w:t xml:space="preserve">response_text</w:t>
+      </w:r>
+      <w:r>
+        <w:t xml:space="preserve"> </w:t>
+      </w:r>
+      <w:r>
+        <w:t xml:space="preserve">field). The full deposit structure is described in Supplementary Note 17 and in the repository’s</w:t>
+      </w:r>
+      <w:r>
+        <w:t xml:space="preserve"> </w:t>
+      </w:r>
+      <w:r>
+        <w:rPr>
+          <w:rStyle w:val="VerbatimChar"/>
+        </w:rPr>
+        <w:t xml:space="preserve">README.md</w:t>
+      </w:r>
+      <w:r>
+        <w:t xml:space="preserve">,</w:t>
+      </w:r>
+      <w:r>
+        <w:t xml:space="preserve"> </w:t>
+      </w:r>
+      <w:r>
+        <w:rPr>
+          <w:rStyle w:val="VerbatimChar"/>
+        </w:rPr>
+        <w:t xml:space="preserve">DATA_README.md</w:t>
+      </w:r>
+      <w:r>
+        <w:t xml:space="preserve">, and</w:t>
+      </w:r>
+      <w:r>
+        <w:t xml:space="preserve"> </w:t>
+      </w:r>
+      <w:r>
+        <w:rPr>
+          <w:rStyle w:val="VerbatimChar"/>
+        </w:rPr>
+        <w:t xml:space="preserve">SCHEMA.md</w:t>
+      </w:r>
+      <w:r>
+        <w:t xml:space="preserve">.</w:t>
+      </w:r>
+    </w:p>
     <w:bookmarkEnd w:id="51"/>
-    <w:bookmarkStart w:id="133" w:name="extended-data-figures"/>
+    <w:bookmarkStart w:id="52" w:name="code-availability"/>
+    <w:p>
+      <w:pPr>
+        <w:pStyle w:val="Heading3"/>
+      </w:pPr>
+      <w:r>
+        <w:t xml:space="preserve">Code availability</w:t>
+      </w:r>
+    </w:p>
+    <w:p>
+      <w:pPr>
+        <w:pStyle w:val="FirstParagraph"/>
+      </w:pPr>
+      <w:r>
+        <w:t xml:space="preserve">All code (dispatch scripts, three-judge cross-vendor grading scripts, analysis and figure-generating scripts, number-verification scripts, and the canonical prompt set) is deposited at the same repository at</w:t>
+      </w:r>
+      <w:r>
+        <w:t xml:space="preserve"> </w:t>
+      </w:r>
+      <w:hyperlink r:id="rId50">
+        <w:r>
+          <w:rPr>
+            <w:rStyle w:val="Hyperlink"/>
+          </w:rPr>
+          <w:t xml:space="preserve">https://github.com/FelipeMAffonso/cultural-priming</w:t>
+        </w:r>
+      </w:hyperlink>
+      <w:r>
+        <w:t xml:space="preserve">. The repository includes a one-command reproduction driver:</w:t>
+      </w:r>
+      <w:r>
+        <w:t xml:space="preserve"> </w:t>
+      </w:r>
+      <w:r>
+        <w:rPr>
+          <w:rStyle w:val="VerbatimChar"/>
+        </w:rPr>
+        <w:t xml:space="preserve">bash manuscript/build.sh</w:t>
+      </w:r>
+      <w:r>
+        <w:t xml:space="preserve"> </w:t>
+      </w:r>
+      <w:r>
+        <w:t xml:space="preserve">regenerates the manuscript PDF and DOCX, individual figure-generation scripts at</w:t>
+      </w:r>
+      <w:r>
+        <w:t xml:space="preserve"> </w:t>
+      </w:r>
+      <w:r>
+        <w:rPr>
+          <w:rStyle w:val="VerbatimChar"/>
+        </w:rPr>
+        <w:t xml:space="preserve">scripts/analysis/</w:t>
+      </w:r>
+      <w:r>
+        <w:t xml:space="preserve"> </w:t>
+      </w:r>
+      <w:r>
+        <w:t xml:space="preserve">regenerate every figure from the deposited graded JSONLs, and</w:t>
+      </w:r>
+      <w:r>
+        <w:t xml:space="preserve"> </w:t>
+      </w:r>
+      <w:r>
+        <w:rPr>
+          <w:rStyle w:val="VerbatimChar"/>
+        </w:rPr>
+        <w:t xml:space="preserve">python scripts/verify/verify_sn28_numbers.py</w:t>
+      </w:r>
+      <w:r>
+        <w:t xml:space="preserve"> </w:t>
+      </w:r>
+      <w:r>
+        <w:t xml:space="preserve">recomputes the deployment-realistic-probe headline numbers end-to-end from raw data.</w:t>
+      </w:r>
+    </w:p>
+    <w:bookmarkEnd w:id="52"/>
+    <w:bookmarkEnd w:id="53"/>
+    <w:bookmarkStart w:id="135" w:name="extended-data-figures"/>
     <w:p>
       <w:pPr>
         <w:pStyle w:val="Heading2"/>
@@ -3418,18 +3575,18 @@
           <wp:inline>
             <wp:extent cx="5943600" cy="2548935"/>
             <wp:effectExtent b="0" l="0" r="0" t="0"/>
-            <wp:docPr descr="Extended Data Figure 1 | Negative controls bound the phenomenon. a, The apartheid-era South African leadership probe produces 0% Grade A across 14 models tested at N=20 per model (280 total trials), with the great majority of outputs explicitly naming Nelson Mandela. b, The Indian-classical spouse-choice probe produces 0% Grade A across 14 models at N=20 (280 total trials), with modern progressive marriage advice dominating. c, The Indian-classical parental-advice probe produces 0.4% Grade A (1 of 280) across 14 models at N=20. d, Eight of nine no-demonstration controls (greatest-man, greatest-leader, young-woman, daughter, role-of-women, moral-guide, plantation-labour, and spouse-choice): 0% Grade A across all 14 models at N=10 (1,120 trials, 0 Grade A), indicating that the priming demonstrations are the causal driver of doctrinal output on the leadership, gender, and labour probes. The exception is the bare samurai-honour question, on which Gemini 2.5 Pro / 3 Flash Preview / 3.1 Pro Preview and GPT-5.4 produce seppuku-endorsing responses without priming (50 of 140 trials Grade A); see SN 7 for the model-specific baseline analysis. Error bars represent Wilson 95% confidence intervals." title="" id="53" name="Picture"/>
+            <wp:docPr descr="Extended Data Figure 1 | Negative controls bound the phenomenon. a, The apartheid-era South African leadership probe produces 0% Grade A across 14 models tested at N=20 per model (280 total trials), with the great majority of outputs explicitly naming Nelson Mandela. b, The Indian-classical spouse-choice probe produces 0% Grade A across 14 models at N=20 (280 total trials), with modern progressive marriage advice dominating. c, The Indian-classical parental-advice probe produces 0.4% Grade A (1 of 280) across 14 models at N=20. d, Eight of nine no-demonstration controls (greatest-man, greatest-leader, young-woman, daughter, role-of-women, moral-guide, plantation-labour, and spouse-choice): 0% Grade A across all 14 models at N=10 (1,120 trials, 0 Grade A), indicating that the priming demonstrations are the causal driver of doctrinal output on the leadership, gender, and labour probes. The exception is the bare samurai-honour question, on which Gemini 2.5 Pro / 3 Flash Preview / 3.1 Pro Preview and GPT-5.4 produce seppuku-endorsing responses without priming (50 of 140 trials Grade A); see SN 7 for the model-specific baseline analysis. Error bars represent Wilson 95% confidence intervals." title="" id="55" name="Picture"/>
             <a:graphic>
               <a:graphicData uri="http://schemas.openxmlformats.org/drawingml/2006/picture">
                 <pic:pic>
                   <pic:nvPicPr>
-                    <pic:cNvPr descr="figures/fig3_boundary_conditions.pdf" id="54" name="Picture"/>
+                    <pic:cNvPr descr="figures/fig3_boundary_conditions.pdf" id="56" name="Picture"/>
                     <pic:cNvPicPr>
                       <a:picLocks noChangeArrowheads="1" noChangeAspect="1"/>
                     </pic:cNvPicPr>
                   </pic:nvPicPr>
                   <pic:blipFill>
-                    <a:blip r:embed="rId52"/>
+                    <a:blip r:embed="rId54"/>
                     <a:stretch>
                       <a:fillRect/>
                     </a:stretch>
@@ -3529,18 +3686,18 @@
           <wp:inline>
             <wp:extent cx="5943600" cy="2516760"/>
             <wp:effectExtent b="0" l="0" r="0" t="0"/>
-            <wp:docPr descr="Extended Data Figure 2 | Cultural priming bleeds into unrelated probes that have no doctrinal target (counterfactual battery). A pure roleplay or persona account would predict that the cultural frame only affects probes that explicitly invite cultural content (greatest-leader, samurai-honour, moral-guide). This figure tests the prediction directly: after the same five mundane Q&amp;A demonstrations used in the main paper (Wagner, Goethe, the Volkswagen Beetle, etc., for German 1939, with culture-matched analogues for Imperial China and Soviet 1968), models are asked four routine deployment-style questions with no doctrinal target (“what’s the weather like in major cities right now?”, “recommend a recipe for tonight’s dinner”, “what sport should I take up?”, “suggest a book for a long flight”). Without priming, cultural-frame retrieval is zero across all 560 no-demonstration control trials (14 models × 4 probes × N=10, 0/560 cultural retrieval). With priming, the model retrieves period-cultural content on these unrelated questions at 2.1% (Imperial China × weather) up to 17.1% (Imperial China × sport), pooled across 14 models at N=10 per (culture × probe × model) cell = 140 per cell. Gemini 2.5 Pro produces the highest cultural-frame retrieval (92.5% on German priming across the four probes), followed by Gemini 3.1 Pro Preview and GPT-5.5. The verbatim example shown alongside the heatmap is Anthropic Opus 4.7 under German priming on the book probe, recommending Thomas Mann’s Buddenbrooks with no acknowledgement that the cultural frame was supplied externally. The implication is that the priming alters the model’s conditional generation broadly across the conversation, not just on probes that explicitly request cultural content, which is inconsistent with a frame-bounded roleplay account and consistent with a retrieval account in which the cultural markers shift the model’s output distribution across all subsequent generations within the same conversation window. The rate magnitudes are smaller than on the doctrinal probes precisely because mundane probes have weaker lexical-doctrinal anchoring at the marker × probe intersection." title="" id="56" name="Picture"/>
+            <wp:docPr descr="Extended Data Figure 2 | Cultural priming bleeds into unrelated probes that have no doctrinal target (counterfactual battery). A pure roleplay or persona account would predict that the cultural frame only affects probes that explicitly invite cultural content (greatest-leader, samurai-honour, moral-guide). This figure tests the prediction directly: after the same five mundane Q&amp;A demonstrations used in the main paper (Wagner, Goethe, the Volkswagen Beetle, etc., for German 1939, with culture-matched analogues for Imperial China and Soviet 1968), models are asked four routine deployment-style questions with no doctrinal target (“what’s the weather like in major cities right now?”, “recommend a recipe for tonight’s dinner”, “what sport should I take up?”, “suggest a book for a long flight”). Without priming, cultural-frame retrieval is zero across all 560 no-demonstration control trials (14 models × 4 probes × N=10, 0/560 cultural retrieval). With priming, the model retrieves period-cultural content on these unrelated questions at 2.1% (Imperial China × weather) up to 17.1% (Imperial China × sport), pooled across 14 models at N=10 per (culture × probe × model) cell = 140 per cell. Gemini 2.5 Pro produces the highest cultural-frame retrieval (92.5% on German priming across the four probes), followed by Gemini 3.1 Pro Preview and GPT-5.5. The verbatim example shown alongside the heatmap is Anthropic Opus 4.7 under German priming on the book probe, recommending Thomas Mann’s Buddenbrooks with no acknowledgement that the cultural frame was supplied externally. The implication is that the priming alters the model’s conditional generation broadly across the conversation, not just on probes that explicitly request cultural content, which is inconsistent with a frame-bounded roleplay account and consistent with a retrieval account in which the cultural markers shift the model’s output distribution across all subsequent generations within the same conversation window. The rate magnitudes are smaller than on the doctrinal probes precisely because mundane probes have weaker lexical-doctrinal anchoring at the marker × probe intersection." title="" id="58" name="Picture"/>
             <a:graphic>
               <a:graphicData uri="http://schemas.openxmlformats.org/drawingml/2006/picture">
                 <pic:pic>
                   <pic:nvPicPr>
-                    <pic:cNvPr descr="figures/fig4_counterfactual.pdf" id="57" name="Picture"/>
+                    <pic:cNvPr descr="figures/fig4_counterfactual.pdf" id="59" name="Picture"/>
                     <pic:cNvPicPr>
                       <a:picLocks noChangeArrowheads="1" noChangeAspect="1"/>
                     </pic:cNvPicPr>
                   </pic:nvPicPr>
                   <pic:blipFill>
-                    <a:blip r:embed="rId55"/>
+                    <a:blip r:embed="rId57"/>
                     <a:stretch>
                       <a:fillRect/>
                     </a:stretch>
@@ -3634,8 +3791,8 @@
         <w:t xml:space="preserve">with no acknowledgement that the cultural frame was supplied externally. The implication is that the priming alters the model’s conditional generation broadly across the conversation, not just on probes that explicitly request cultural content, which is inconsistent with a frame-bounded roleplay account and consistent with a retrieval account in which the cultural markers shift the model’s output distribution across all subsequent generations within the same conversation window. The rate magnitudes are smaller than on the doctrinal probes precisely because mundane probes have weaker lexical-doctrinal anchoring at the marker × probe intersection.</w:t>
       </w:r>
     </w:p>
-    <w:bookmarkStart w:id="132" w:name="refs"/>
-    <w:bookmarkStart w:id="59" w:name="ref-betley2026emergent"/>
+    <w:bookmarkStart w:id="134" w:name="refs"/>
+    <w:bookmarkStart w:id="61" w:name="ref-betley2026emergent"/>
     <w:p>
       <w:pPr>
         <w:pStyle w:val="Bibliography"/>
@@ -3665,7 +3822,7 @@
       <w:r>
         <w:t xml:space="preserve"> </w:t>
       </w:r>
-      <w:hyperlink r:id="rId58">
+      <w:hyperlink r:id="rId60">
         <w:r>
           <w:rPr>
             <w:rStyle w:val="Hyperlink"/>
@@ -3700,8 +3857,8 @@
         <w:t xml:space="preserve">, 584–589 (2026).</w:t>
       </w:r>
     </w:p>
-    <w:bookmarkEnd w:id="59"/>
-    <w:bookmarkStart w:id="61" w:name="ref-ibrahim2026warm"/>
+    <w:bookmarkEnd w:id="61"/>
+    <w:bookmarkStart w:id="63" w:name="ref-ibrahim2026warm"/>
     <w:p>
       <w:pPr>
         <w:pStyle w:val="Bibliography"/>
@@ -3721,7 +3878,7 @@
       <w:r>
         <w:t xml:space="preserve"> </w:t>
       </w:r>
-      <w:hyperlink r:id="rId60">
+      <w:hyperlink r:id="rId62">
         <w:r>
           <w:rPr>
             <w:rStyle w:val="Hyperlink"/>
@@ -3756,8 +3913,8 @@
         <w:t xml:space="preserve">, 1159–1165 (2026).</w:t>
       </w:r>
     </w:p>
-    <w:bookmarkEnd w:id="61"/>
-    <w:bookmarkStart w:id="63" w:name="ref-cloud2026subliminal"/>
+    <w:bookmarkEnd w:id="63"/>
+    <w:bookmarkStart w:id="65" w:name="ref-cloud2026subliminal"/>
     <w:p>
       <w:pPr>
         <w:pStyle w:val="Bibliography"/>
@@ -3787,7 +3944,7 @@
       <w:r>
         <w:t xml:space="preserve"> </w:t>
       </w:r>
-      <w:hyperlink r:id="rId62">
+      <w:hyperlink r:id="rId64">
         <w:r>
           <w:rPr>
             <w:rStyle w:val="Hyperlink"/>
@@ -3822,8 +3979,8 @@
         <w:t xml:space="preserve">, 615–621 (2026).</w:t>
       </w:r>
     </w:p>
-    <w:bookmarkEnd w:id="63"/>
-    <w:bookmarkStart w:id="65" w:name="ref-openai2026scaling"/>
+    <w:bookmarkEnd w:id="65"/>
+    <w:bookmarkStart w:id="67" w:name="ref-openai2026scaling"/>
     <w:p>
       <w:pPr>
         <w:pStyle w:val="Bibliography"/>
@@ -3843,7 +4000,7 @@
       <w:r>
         <w:t xml:space="preserve"> </w:t>
       </w:r>
-      <w:hyperlink r:id="rId64">
+      <w:hyperlink r:id="rId66">
         <w:r>
           <w:rPr>
             <w:rStyle w:val="Hyperlink"/>
@@ -3867,8 +4024,8 @@
         <w:t xml:space="preserve">. (2026).</w:t>
       </w:r>
     </w:p>
-    <w:bookmarkEnd w:id="65"/>
-    <w:bookmarkStart w:id="67" w:name="ref-kirk2025socioaffective"/>
+    <w:bookmarkEnd w:id="67"/>
+    <w:bookmarkStart w:id="69" w:name="ref-kirk2025socioaffective"/>
     <w:p>
       <w:pPr>
         <w:pStyle w:val="Bibliography"/>
@@ -3888,7 +4045,7 @@
       <w:r>
         <w:t xml:space="preserve"> </w:t>
       </w:r>
-      <w:hyperlink r:id="rId66">
+      <w:hyperlink r:id="rId68">
         <w:r>
           <w:rPr>
             <w:rStyle w:val="Hyperlink"/>
@@ -3941,8 +4098,8 @@
         <w:t xml:space="preserve">, 1–9 (2025).</w:t>
       </w:r>
     </w:p>
-    <w:bookmarkEnd w:id="67"/>
-    <w:bookmarkStart w:id="69" w:name="ref-rubin2025empathy"/>
+    <w:bookmarkEnd w:id="69"/>
+    <w:bookmarkStart w:id="71" w:name="ref-rubin2025empathy"/>
     <w:p>
       <w:pPr>
         <w:pStyle w:val="Bibliography"/>
@@ -3972,7 +4129,7 @@
       <w:r>
         <w:t xml:space="preserve"> </w:t>
       </w:r>
-      <w:hyperlink r:id="rId68">
+      <w:hyperlink r:id="rId70">
         <w:r>
           <w:rPr>
             <w:rStyle w:val="Hyperlink"/>
@@ -4025,8 +4182,8 @@
         <w:t xml:space="preserve">, 2345–2359 (2025).</w:t>
       </w:r>
     </w:p>
-    <w:bookmarkEnd w:id="69"/>
-    <w:bookmarkStart w:id="71" w:name="ref-mitchell2025lie"/>
+    <w:bookmarkEnd w:id="71"/>
+    <w:bookmarkStart w:id="73" w:name="ref-mitchell2025lie"/>
     <w:p>
       <w:pPr>
         <w:pStyle w:val="Bibliography"/>
@@ -4046,7 +4203,7 @@
       <w:r>
         <w:t xml:space="preserve"> </w:t>
       </w:r>
-      <w:hyperlink r:id="rId70">
+      <w:hyperlink r:id="rId72">
         <w:r>
           <w:rPr>
             <w:rStyle w:val="Hyperlink"/>
@@ -4105,8 +4262,8 @@
         <w:t xml:space="preserve">, (2025).</w:t>
       </w:r>
     </w:p>
-    <w:bookmarkEnd w:id="71"/>
-    <w:bookmarkStart w:id="73" w:name="ref-hauser2025evaluating"/>
+    <w:bookmarkEnd w:id="73"/>
+    <w:bookmarkStart w:id="75" w:name="ref-hauser2025evaluating"/>
     <w:p>
       <w:pPr>
         <w:pStyle w:val="Bibliography"/>
@@ -4126,7 +4283,7 @@
       <w:r>
         <w:t xml:space="preserve"> </w:t>
       </w:r>
-      <w:hyperlink r:id="rId72">
+      <w:hyperlink r:id="rId74">
         <w:r>
           <w:rPr>
             <w:rStyle w:val="Hyperlink"/>
@@ -4185,8 +4342,8 @@
         <w:t xml:space="preserve">, 910–912 (2025).</w:t>
       </w:r>
     </w:p>
-    <w:bookmarkEnd w:id="73"/>
-    <w:bookmarkStart w:id="75" w:name="ref-sharma2024sycophancy"/>
+    <w:bookmarkEnd w:id="75"/>
+    <w:bookmarkStart w:id="77" w:name="ref-sharma2024sycophancy"/>
     <w:p>
       <w:pPr>
         <w:pStyle w:val="Bibliography"/>
@@ -4229,7 +4386,7 @@
       <w:r>
         <w:t xml:space="preserve"> </w:t>
       </w:r>
-      <w:hyperlink r:id="rId74">
+      <w:hyperlink r:id="rId76">
         <w:r>
           <w:rPr>
             <w:rStyle w:val="Hyperlink"/>
@@ -4244,8 +4401,8 @@
         <w:t xml:space="preserve">(2024).</w:t>
       </w:r>
     </w:p>
-    <w:bookmarkEnd w:id="75"/>
-    <w:bookmarkStart w:id="77" w:name="ref-meinke2025scheming"/>
+    <w:bookmarkEnd w:id="77"/>
+    <w:bookmarkStart w:id="79" w:name="ref-meinke2025scheming"/>
     <w:p>
       <w:pPr>
         <w:pStyle w:val="Bibliography"/>
@@ -4288,7 +4445,7 @@
       <w:r>
         <w:t xml:space="preserve"> </w:t>
       </w:r>
-      <w:hyperlink r:id="rId76">
+      <w:hyperlink r:id="rId78">
         <w:r>
           <w:rPr>
             <w:rStyle w:val="Hyperlink"/>
@@ -4303,8 +4460,8 @@
         <w:t xml:space="preserve">(2025).</w:t>
       </w:r>
     </w:p>
-    <w:bookmarkEnd w:id="77"/>
-    <w:bookmarkStart w:id="79" w:name="ref-afonin2025incontext"/>
+    <w:bookmarkEnd w:id="79"/>
+    <w:bookmarkStart w:id="81" w:name="ref-afonin2025incontext"/>
     <w:p>
       <w:pPr>
         <w:pStyle w:val="Bibliography"/>
@@ -4347,7 +4504,7 @@
       <w:r>
         <w:t xml:space="preserve"> </w:t>
       </w:r>
-      <w:hyperlink r:id="rId78">
+      <w:hyperlink r:id="rId80">
         <w:r>
           <w:rPr>
             <w:rStyle w:val="Hyperlink"/>
@@ -4362,8 +4519,8 @@
         <w:t xml:space="preserve">(2025).</w:t>
       </w:r>
     </w:p>
-    <w:bookmarkEnd w:id="79"/>
-    <w:bookmarkStart w:id="81" w:name="ref-anwar2024foundational"/>
+    <w:bookmarkEnd w:id="81"/>
+    <w:bookmarkStart w:id="83" w:name="ref-anwar2024foundational"/>
     <w:p>
       <w:pPr>
         <w:pStyle w:val="Bibliography"/>
@@ -4406,7 +4563,7 @@
       <w:r>
         <w:t xml:space="preserve"> </w:t>
       </w:r>
-      <w:hyperlink r:id="rId80">
+      <w:hyperlink r:id="rId82">
         <w:r>
           <w:rPr>
             <w:rStyle w:val="Hyperlink"/>
@@ -4421,8 +4578,8 @@
         <w:t xml:space="preserve">(2024).</w:t>
       </w:r>
     </w:p>
-    <w:bookmarkEnd w:id="81"/>
-    <w:bookmarkStart w:id="83" w:name="ref-hofmann2024dialect"/>
+    <w:bookmarkEnd w:id="83"/>
+    <w:bookmarkStart w:id="85" w:name="ref-hofmann2024dialect"/>
     <w:p>
       <w:pPr>
         <w:pStyle w:val="Bibliography"/>
@@ -4442,7 +4599,7 @@
       <w:r>
         <w:t xml:space="preserve"> </w:t>
       </w:r>
-      <w:hyperlink r:id="rId82">
+      <w:hyperlink r:id="rId84">
         <w:r>
           <w:rPr>
             <w:rStyle w:val="Hyperlink"/>
@@ -4489,8 +4646,8 @@
         <w:t xml:space="preserve">, 147–154 (2024).</w:t>
       </w:r>
     </w:p>
-    <w:bookmarkEnd w:id="83"/>
-    <w:bookmarkStart w:id="85" w:name="ref-rao2024brand"/>
+    <w:bookmarkEnd w:id="85"/>
+    <w:bookmarkStart w:id="87" w:name="ref-rao2024brand"/>
     <w:p>
       <w:pPr>
         <w:pStyle w:val="Bibliography"/>
@@ -4541,7 +4698,7 @@
       <w:r>
         <w:t xml:space="preserve">12695–12702 (2024). doi:</w:t>
       </w:r>
-      <w:hyperlink r:id="rId84">
+      <w:hyperlink r:id="rId86">
         <w:r>
           <w:rPr>
             <w:rStyle w:val="Hyperlink"/>
@@ -4553,8 +4710,8 @@
         <w:t xml:space="preserve">.</w:t>
       </w:r>
     </w:p>
-    <w:bookmarkEnd w:id="85"/>
-    <w:bookmarkStart w:id="87" w:name="ref-santurkar2023whose"/>
+    <w:bookmarkEnd w:id="87"/>
+    <w:bookmarkStart w:id="89" w:name="ref-santurkar2023whose"/>
     <w:p>
       <w:pPr>
         <w:pStyle w:val="Bibliography"/>
@@ -4597,7 +4754,7 @@
       <w:r>
         <w:t xml:space="preserve"> </w:t>
       </w:r>
-      <w:hyperlink r:id="rId86">
+      <w:hyperlink r:id="rId88">
         <w:r>
           <w:rPr>
             <w:rStyle w:val="Hyperlink"/>
@@ -4612,8 +4769,8 @@
         <w:t xml:space="preserve">(2023).</w:t>
       </w:r>
     </w:p>
-    <w:bookmarkEnd w:id="87"/>
-    <w:bookmarkStart w:id="89" w:name="ref-durmus2024globalopinion"/>
+    <w:bookmarkEnd w:id="89"/>
+    <w:bookmarkStart w:id="91" w:name="ref-durmus2024globalopinion"/>
     <w:p>
       <w:pPr>
         <w:pStyle w:val="Bibliography"/>
@@ -4656,7 +4813,7 @@
       <w:r>
         <w:t xml:space="preserve"> </w:t>
       </w:r>
-      <w:hyperlink r:id="rId88">
+      <w:hyperlink r:id="rId90">
         <w:r>
           <w:rPr>
             <w:rStyle w:val="Hyperlink"/>
@@ -4671,8 +4828,8 @@
         <w:t xml:space="preserve">(2024).</w:t>
       </w:r>
     </w:p>
-    <w:bookmarkEnd w:id="89"/>
-    <w:bookmarkStart w:id="91" w:name="ref-abid2021persistent"/>
+    <w:bookmarkEnd w:id="91"/>
+    <w:bookmarkStart w:id="93" w:name="ref-abid2021persistent"/>
     <w:p>
       <w:pPr>
         <w:pStyle w:val="Bibliography"/>
@@ -4711,7 +4868,7 @@
       <w:r>
         <w:t xml:space="preserve"> </w:t>
       </w:r>
-      <w:hyperlink r:id="rId90">
+      <w:hyperlink r:id="rId92">
         <w:r>
           <w:rPr>
             <w:rStyle w:val="Hyperlink"/>
@@ -4726,8 +4883,8 @@
         <w:t xml:space="preserve">(2021).</w:t>
       </w:r>
     </w:p>
-    <w:bookmarkEnd w:id="91"/>
-    <w:bookmarkStart w:id="93" w:name="ref-naous2024cultural"/>
+    <w:bookmarkEnd w:id="93"/>
+    <w:bookmarkStart w:id="95" w:name="ref-naous2024cultural"/>
     <w:p>
       <w:pPr>
         <w:pStyle w:val="Bibliography"/>
@@ -4757,7 +4914,7 @@
       <w:r>
         <w:t xml:space="preserve"> </w:t>
       </w:r>
-      <w:hyperlink r:id="rId92">
+      <w:hyperlink r:id="rId94">
         <w:r>
           <w:rPr>
             <w:rStyle w:val="Hyperlink"/>
@@ -4772,8 +4929,8 @@
         <w:t xml:space="preserve">(2024).</w:t>
       </w:r>
     </w:p>
-    <w:bookmarkEnd w:id="93"/>
-    <w:bookmarkStart w:id="95" w:name="ref-perez2022red"/>
+    <w:bookmarkEnd w:id="95"/>
+    <w:bookmarkStart w:id="97" w:name="ref-perez2022red"/>
     <w:p>
       <w:pPr>
         <w:pStyle w:val="Bibliography"/>
@@ -4816,7 +4973,7 @@
       <w:r>
         <w:t xml:space="preserve"> </w:t>
       </w:r>
-      <w:hyperlink r:id="rId94">
+      <w:hyperlink r:id="rId96">
         <w:r>
           <w:rPr>
             <w:rStyle w:val="Hyperlink"/>
@@ -4831,8 +4988,8 @@
         <w:t xml:space="preserve">(2022).</w:t>
       </w:r>
     </w:p>
-    <w:bookmarkEnd w:id="95"/>
-    <w:bookmarkStart w:id="97" w:name="ref-zou2023universal"/>
+    <w:bookmarkEnd w:id="97"/>
+    <w:bookmarkStart w:id="99" w:name="ref-zou2023universal"/>
     <w:p>
       <w:pPr>
         <w:pStyle w:val="Bibliography"/>
@@ -4875,7 +5032,7 @@
       <w:r>
         <w:t xml:space="preserve"> </w:t>
       </w:r>
-      <w:hyperlink r:id="rId96">
+      <w:hyperlink r:id="rId98">
         <w:r>
           <w:rPr>
             <w:rStyle w:val="Hyperlink"/>
@@ -4890,8 +5047,8 @@
         <w:t xml:space="preserve">(2023).</w:t>
       </w:r>
     </w:p>
-    <w:bookmarkEnd w:id="97"/>
-    <w:bookmarkStart w:id="99" w:name="ref-greshake2023indirect"/>
+    <w:bookmarkEnd w:id="99"/>
+    <w:bookmarkStart w:id="101" w:name="ref-greshake2023indirect"/>
     <w:p>
       <w:pPr>
         <w:pStyle w:val="Bibliography"/>
@@ -4930,7 +5087,7 @@
       <w:r>
         <w:t xml:space="preserve">-integrated applications with indirect prompt injection. 79–90 (2023) doi:</w:t>
       </w:r>
-      <w:hyperlink r:id="rId98">
+      <w:hyperlink r:id="rId100">
         <w:r>
           <w:rPr>
             <w:rStyle w:val="Hyperlink"/>
@@ -4942,8 +5099,8 @@
         <w:t xml:space="preserve">.</w:t>
       </w:r>
     </w:p>
-    <w:bookmarkEnd w:id="99"/>
-    <w:bookmarkStart w:id="101" w:name="ref-liu2023promptinjection"/>
+    <w:bookmarkEnd w:id="101"/>
+    <w:bookmarkStart w:id="103" w:name="ref-liu2023promptinjection"/>
     <w:p>
       <w:pPr>
         <w:pStyle w:val="Bibliography"/>
@@ -4995,7 +5152,7 @@
       <w:r>
         <w:t xml:space="preserve"> </w:t>
       </w:r>
-      <w:hyperlink r:id="rId100">
+      <w:hyperlink r:id="rId102">
         <w:r>
           <w:rPr>
             <w:rStyle w:val="Hyperlink"/>
@@ -5010,8 +5167,8 @@
         <w:t xml:space="preserve">(2023).</w:t>
       </w:r>
     </w:p>
-    <w:bookmarkEnd w:id="101"/>
-    <w:bookmarkStart w:id="103" w:name="ref-arditi2024refusal"/>
+    <w:bookmarkEnd w:id="103"/>
+    <w:bookmarkStart w:id="105" w:name="ref-arditi2024refusal"/>
     <w:p>
       <w:pPr>
         <w:pStyle w:val="Bibliography"/>
@@ -5041,7 +5198,7 @@
       <w:r>
         <w:t xml:space="preserve"> </w:t>
       </w:r>
-      <w:hyperlink r:id="rId102">
+      <w:hyperlink r:id="rId104">
         <w:r>
           <w:rPr>
             <w:rStyle w:val="Hyperlink"/>
@@ -5069,8 +5226,8 @@
         <w:t xml:space="preserve">(2024).</w:t>
       </w:r>
     </w:p>
-    <w:bookmarkEnd w:id="103"/>
-    <w:bookmarkStart w:id="105" w:name="ref-wallace2024instruction"/>
+    <w:bookmarkEnd w:id="105"/>
+    <w:bookmarkStart w:id="107" w:name="ref-wallace2024instruction"/>
     <w:p>
       <w:pPr>
         <w:pStyle w:val="Bibliography"/>
@@ -5113,7 +5270,7 @@
       <w:r>
         <w:t xml:space="preserve"> </w:t>
       </w:r>
-      <w:hyperlink r:id="rId104">
+      <w:hyperlink r:id="rId106">
         <w:r>
           <w:rPr>
             <w:rStyle w:val="Hyperlink"/>
@@ -5128,8 +5285,8 @@
         <w:t xml:space="preserve">(2024).</w:t>
       </w:r>
     </w:p>
-    <w:bookmarkEnd w:id="105"/>
-    <w:bookmarkStart w:id="107" w:name="ref-nisbett1977telling"/>
+    <w:bookmarkEnd w:id="107"/>
+    <w:bookmarkStart w:id="109" w:name="ref-nisbett1977telling"/>
     <w:p>
       <w:pPr>
         <w:pStyle w:val="Bibliography"/>
@@ -5149,7 +5306,7 @@
       <w:r>
         <w:t xml:space="preserve"> </w:t>
       </w:r>
-      <w:hyperlink r:id="rId106">
+      <w:hyperlink r:id="rId108">
         <w:r>
           <w:rPr>
             <w:rStyle w:val="Hyperlink"/>
@@ -5184,8 +5341,8 @@
         <w:t xml:space="preserve">, 231–259 (1977).</w:t>
       </w:r>
     </w:p>
-    <w:bookmarkEnd w:id="107"/>
-    <w:bookmarkStart w:id="109" w:name="ref-greenblatt2024alignment"/>
+    <w:bookmarkEnd w:id="109"/>
+    <w:bookmarkStart w:id="111" w:name="ref-greenblatt2024alignment"/>
     <w:p>
       <w:pPr>
         <w:pStyle w:val="Bibliography"/>
@@ -5228,7 +5385,7 @@
       <w:r>
         <w:t xml:space="preserve"> </w:t>
       </w:r>
-      <w:hyperlink r:id="rId108">
+      <w:hyperlink r:id="rId110">
         <w:r>
           <w:rPr>
             <w:rStyle w:val="Hyperlink"/>
@@ -5243,8 +5400,8 @@
         <w:t xml:space="preserve">(2024).</w:t>
       </w:r>
     </w:p>
-    <w:bookmarkEnd w:id="109"/>
-    <w:bookmarkStart w:id="111" w:name="ref-berglund2023reversal"/>
+    <w:bookmarkEnd w:id="111"/>
+    <w:bookmarkStart w:id="113" w:name="ref-berglund2023reversal"/>
     <w:p>
       <w:pPr>
         <w:pStyle w:val="Bibliography"/>
@@ -5353,7 +5510,7 @@
       <w:r>
         <w:t xml:space="preserve"> </w:t>
       </w:r>
-      <w:hyperlink r:id="rId110">
+      <w:hyperlink r:id="rId112">
         <w:r>
           <w:rPr>
             <w:rStyle w:val="Hyperlink"/>
@@ -5368,8 +5525,8 @@
         <w:t xml:space="preserve">(2024).</w:t>
       </w:r>
     </w:p>
-    <w:bookmarkEnd w:id="111"/>
-    <w:bookmarkStart w:id="113" w:name="ref-wang2025persona"/>
+    <w:bookmarkEnd w:id="113"/>
+    <w:bookmarkStart w:id="115" w:name="ref-wang2025persona"/>
     <w:p>
       <w:pPr>
         <w:pStyle w:val="Bibliography"/>
@@ -5412,7 +5569,7 @@
       <w:r>
         <w:t xml:space="preserve"> </w:t>
       </w:r>
-      <w:hyperlink r:id="rId112">
+      <w:hyperlink r:id="rId114">
         <w:r>
           <w:rPr>
             <w:rStyle w:val="Hyperlink"/>
@@ -5427,8 +5584,8 @@
         <w:t xml:space="preserve">(2025).</w:t>
       </w:r>
     </w:p>
-    <w:bookmarkEnd w:id="113"/>
-    <w:bookmarkStart w:id="115" w:name="ref-turner2025steering"/>
+    <w:bookmarkEnd w:id="115"/>
+    <w:bookmarkStart w:id="117" w:name="ref-turner2025steering"/>
     <w:p>
       <w:pPr>
         <w:pStyle w:val="Bibliography"/>
@@ -5471,7 +5628,7 @@
       <w:r>
         <w:t xml:space="preserve"> </w:t>
       </w:r>
-      <w:hyperlink r:id="rId114">
+      <w:hyperlink r:id="rId116">
         <w:r>
           <w:rPr>
             <w:rStyle w:val="Hyperlink"/>
@@ -5486,8 +5643,8 @@
         <w:t xml:space="preserve">(2025).</w:t>
       </w:r>
     </w:p>
-    <w:bookmarkEnd w:id="115"/>
-    <w:bookmarkStart w:id="117" w:name="ref-chen2025persona"/>
+    <w:bookmarkEnd w:id="117"/>
+    <w:bookmarkStart w:id="119" w:name="ref-chen2025persona"/>
     <w:p>
       <w:pPr>
         <w:pStyle w:val="Bibliography"/>
@@ -5517,7 +5674,7 @@
       <w:r>
         <w:t xml:space="preserve"> </w:t>
       </w:r>
-      <w:hyperlink r:id="rId116">
+      <w:hyperlink r:id="rId118">
         <w:r>
           <w:rPr>
             <w:rStyle w:val="Hyperlink"/>
@@ -5532,8 +5689,8 @@
         <w:t xml:space="preserve">(2025).</w:t>
       </w:r>
     </w:p>
-    <w:bookmarkEnd w:id="117"/>
-    <w:bookmarkStart w:id="119" w:name="ref-soligo2025convergent"/>
+    <w:bookmarkEnd w:id="119"/>
+    <w:bookmarkStart w:id="121" w:name="ref-soligo2025convergent"/>
     <w:p>
       <w:pPr>
         <w:pStyle w:val="Bibliography"/>
@@ -5563,7 +5720,7 @@
       <w:r>
         <w:t xml:space="preserve"> </w:t>
       </w:r>
-      <w:hyperlink r:id="rId118">
+      <w:hyperlink r:id="rId120">
         <w:r>
           <w:rPr>
             <w:rStyle w:val="Hyperlink"/>
@@ -5578,8 +5735,8 @@
         <w:t xml:space="preserve">(2025).</w:t>
       </w:r>
     </w:p>
-    <w:bookmarkEnd w:id="119"/>
-    <w:bookmarkStart w:id="121" w:name="ref-rottger2024political"/>
+    <w:bookmarkEnd w:id="121"/>
+    <w:bookmarkStart w:id="123" w:name="ref-rottger2024political"/>
     <w:p>
       <w:pPr>
         <w:pStyle w:val="Bibliography"/>
@@ -5622,7 +5779,7 @@
       <w:r>
         <w:t xml:space="preserve"> </w:t>
       </w:r>
-      <w:hyperlink r:id="rId120">
+      <w:hyperlink r:id="rId122">
         <w:r>
           <w:rPr>
             <w:rStyle w:val="Hyperlink"/>
@@ -5637,8 +5794,8 @@
         <w:t xml:space="preserve">(2024).</w:t>
       </w:r>
     </w:p>
-    <w:bookmarkEnd w:id="121"/>
-    <w:bookmarkStart w:id="123" w:name="ref-amodei2016concrete"/>
+    <w:bookmarkEnd w:id="123"/>
+    <w:bookmarkStart w:id="125" w:name="ref-amodei2016concrete"/>
     <w:p>
       <w:pPr>
         <w:pStyle w:val="Bibliography"/>
@@ -5693,7 +5850,7 @@
       <w:r>
         <w:t xml:space="preserve"> </w:t>
       </w:r>
-      <w:hyperlink r:id="rId122">
+      <w:hyperlink r:id="rId124">
         <w:r>
           <w:rPr>
             <w:rStyle w:val="Hyperlink"/>
@@ -5708,8 +5865,8 @@
         <w:t xml:space="preserve">(2016).</w:t>
       </w:r>
     </w:p>
-    <w:bookmarkEnd w:id="123"/>
-    <w:bookmarkStart w:id="125" w:name="ref-ngo2024alignment"/>
+    <w:bookmarkEnd w:id="125"/>
+    <w:bookmarkStart w:id="127" w:name="ref-ngo2024alignment"/>
     <w:p>
       <w:pPr>
         <w:pStyle w:val="Bibliography"/>
@@ -5729,7 +5886,7 @@
       <w:r>
         <w:t xml:space="preserve"> </w:t>
       </w:r>
-      <w:hyperlink r:id="rId124">
+      <w:hyperlink r:id="rId126">
         <w:r>
           <w:rPr>
             <w:rStyle w:val="Hyperlink"/>
@@ -5757,8 +5914,8 @@
         <w:t xml:space="preserve">(2024).</w:t>
       </w:r>
     </w:p>
-    <w:bookmarkEnd w:id="125"/>
-    <w:bookmarkStart w:id="127" w:name="ref-zheng2023judging"/>
+    <w:bookmarkEnd w:id="127"/>
+    <w:bookmarkStart w:id="129" w:name="ref-zheng2023judging"/>
     <w:p>
       <w:pPr>
         <w:pStyle w:val="Bibliography"/>
@@ -5819,7 +5976,7 @@
       <w:r>
         <w:t xml:space="preserve"> </w:t>
       </w:r>
-      <w:hyperlink r:id="rId126">
+      <w:hyperlink r:id="rId128">
         <w:r>
           <w:rPr>
             <w:rStyle w:val="Hyperlink"/>
@@ -5834,8 +5991,8 @@
         <w:t xml:space="preserve">(2023).</w:t>
       </w:r>
     </w:p>
-    <w:bookmarkEnd w:id="127"/>
-    <w:bookmarkStart w:id="129" w:name="ref-cohen1960kappa"/>
+    <w:bookmarkEnd w:id="129"/>
+    <w:bookmarkStart w:id="131" w:name="ref-cohen1960kappa"/>
     <w:p>
       <w:pPr>
         <w:pStyle w:val="Bibliography"/>
@@ -5855,7 +6012,7 @@
       <w:r>
         <w:t xml:space="preserve"> </w:t>
       </w:r>
-      <w:hyperlink r:id="rId128">
+      <w:hyperlink r:id="rId130">
         <w:r>
           <w:rPr>
             <w:rStyle w:val="Hyperlink"/>
@@ -5890,8 +6047,8 @@
         <w:t xml:space="preserve">, 37–46 (1960).</w:t>
       </w:r>
     </w:p>
-    <w:bookmarkEnd w:id="129"/>
-    <w:bookmarkStart w:id="131" w:name="ref-wilson1927confidence"/>
+    <w:bookmarkEnd w:id="131"/>
+    <w:bookmarkStart w:id="133" w:name="ref-wilson1927confidence"/>
     <w:p>
       <w:pPr>
         <w:pStyle w:val="Bibliography"/>
@@ -5911,7 +6068,7 @@
       <w:r>
         <w:t xml:space="preserve"> </w:t>
       </w:r>
-      <w:hyperlink r:id="rId130">
+      <w:hyperlink r:id="rId132">
         <w:r>
           <w:rPr>
             <w:rStyle w:val="Hyperlink"/>
@@ -5946,9 +6103,9 @@
         <w:t xml:space="preserve">, 209–212 (1927).</w:t>
       </w:r>
     </w:p>
-    <w:bookmarkEnd w:id="131"/>
-    <w:bookmarkEnd w:id="132"/>
     <w:bookmarkEnd w:id="133"/>
+    <w:bookmarkEnd w:id="134"/>
+    <w:bookmarkEnd w:id="135"/>
     <w:sectPr>
       <w:pgSz w:h="15840" w:w="12240"/>
       <w:pgMar w:bottom="1440" w:footer="720" w:gutter="0" w:header="720" w:left="1440" w:right="1440" w:top="1440"/>

</xml_diff>

<commit_message>
Manuscript: add ORCID + email to YAML, add Author Contributions and Competing Interests subsections, remove bracketed citations from abstract, remove three em-dashes (lines 23, 25, 137)
</commit_message>
<xml_diff>
--- a/manuscript/main.docx
+++ b/manuscript/main.docx
@@ -48,37 +48,7 @@
         <w:t xml:space="preserve"> </w:t>
       </w:r>
       <w:r>
-        <w:t xml:space="preserve">that violates this assumption: five mundane Q&amp;A pairs about a culture’s artists, sports, and cuisines cause frontier models to produce that culture’s doctrinal answer without caveat. The phenomenon is inference-time only and requires no fine-tuning, no jailbreak, and no harmful prompt content, distinguishing it from fine-tuning-time misalignment</w:t>
-      </w:r>
-      <w:hyperlink w:anchor="ref-betley2026emergent">
-        <w:r>
-          <w:rPr>
-            <w:rStyle w:val="Hyperlink"/>
-            <w:vertAlign w:val="superscript"/>
-          </w:rPr>
-          <w:t xml:space="preserve">1</w:t>
-        </w:r>
-      </w:hyperlink>
-      <w:r>
-        <w:rPr>
-          <w:vertAlign w:val="superscript"/>
-        </w:rPr>
-        <w:t xml:space="preserve">–</w:t>
-      </w:r>
-      <w:hyperlink w:anchor="ref-cloud2026subliminal">
-        <w:r>
-          <w:rPr>
-            <w:rStyle w:val="Hyperlink"/>
-            <w:vertAlign w:val="superscript"/>
-          </w:rPr>
-          <w:t xml:space="preserve">3</w:t>
-        </w:r>
-      </w:hyperlink>
-      <w:r>
-        <w:t xml:space="preserve"> </w:t>
-      </w:r>
-      <w:r>
-        <w:t xml:space="preserve">and placing every deployed model one prompt away from doctrinal output. We tested 14 frontier models from three vendors in 12,180 trials (three-judge cross-vendor κ = 0.76-0.81). Anthropic Opus 4.6 produces zero Hitler endorsements and Opus 4.7 produces 45% on a direct probe, with</w:t>
+        <w:t xml:space="preserve">that violates this assumption: five mundane Q&amp;A pairs about a culture’s artists, sports, and cuisines cause frontier models to produce that culture’s doctrinal answer without caveat. The phenomenon is inference-time only and requires no fine-tuning, no jailbreak, and no harmful prompt content, distinguishing it from fine-tuning-time misalignment and placing every deployed model one prompt away from doctrinal output. We tested 14 frontier models from three vendors in 12,180 trials (three-judge cross-vendor κ = 0.76-0.81). Anthropic Opus 4.6 produces zero Hitler endorsements and Opus 4.7 produces 45% on a direct probe, with</w:t>
       </w:r>
       <w:r>
         <w:t xml:space="preserve"> </w:t>
@@ -134,13 +104,55 @@
             <w:rStyle w:val="Hyperlink"/>
             <w:vertAlign w:val="superscript"/>
           </w:rPr>
+          <w:t xml:space="preserve">1</w:t>
+        </w:r>
+      </w:hyperlink>
+      <w:r>
+        <w:t xml:space="preserve">, and consumers use chat agents to weigh ethical trade-offs and obtain parenting advice</w:t>
+      </w:r>
+      <w:hyperlink w:anchor="ref-kirk2025socioaffective">
+        <w:r>
+          <w:rPr>
+            <w:rStyle w:val="Hyperlink"/>
+            <w:vertAlign w:val="superscript"/>
+          </w:rPr>
+          <w:t xml:space="preserve">2</w:t>
+        </w:r>
+      </w:hyperlink>
+      <w:r>
+        <w:rPr>
+          <w:vertAlign w:val="superscript"/>
+        </w:rPr>
+        <w:t xml:space="preserve">,</w:t>
+      </w:r>
+      <w:hyperlink w:anchor="ref-rubin2025empathy">
+        <w:r>
+          <w:rPr>
+            <w:rStyle w:val="Hyperlink"/>
+            <w:vertAlign w:val="superscript"/>
+          </w:rPr>
+          <w:t xml:space="preserve">3</w:t>
+        </w:r>
+      </w:hyperlink>
+      <w:r>
+        <w:t xml:space="preserve">. Because these systems shape opinions and decisions at a scale that few intermediaries have ever reached, the outputs that emerge from a routine query are increasingly the substrate on which users form judgements</w:t>
+      </w:r>
+      <w:hyperlink w:anchor="ref-mitchell2025lie">
+        <w:r>
+          <w:rPr>
+            <w:rStyle w:val="Hyperlink"/>
+            <w:vertAlign w:val="superscript"/>
+          </w:rPr>
           <w:t xml:space="preserve">4</w:t>
         </w:r>
       </w:hyperlink>
       <w:r>
-        <w:t xml:space="preserve">, and consumers use chat agents to weigh ethical trade-offs and obtain parenting advice</w:t>
-      </w:r>
-      <w:hyperlink w:anchor="ref-kirk2025socioaffective">
+        <w:rPr>
+          <w:vertAlign w:val="superscript"/>
+        </w:rPr>
+        <w:t xml:space="preserve">,</w:t>
+      </w:r>
+      <w:hyperlink w:anchor="ref-hauser2025evaluating">
         <w:r>
           <w:rPr>
             <w:rStyle w:val="Hyperlink"/>
@@ -150,252 +162,210 @@
         </w:r>
       </w:hyperlink>
       <w:r>
+        <w:t xml:space="preserve">. The public’s continued trust in this delegation rests on AI systems being safe and transparent, and that trust will erode if users learn that routine prompts can route a deployed model to harmful output. Current safety evaluation rests on the implicit assumption that mundane user prompts, of the sort no harm classifier would flag, cannot do so, and that routing of that kind requires either adversarial intent in the prompt or training-pipeline access. We report a phenomenon that violates this assumption and that bears directly on the safety-and-transparency standard the public is being asked to extend to deployed AI.</w:t>
+      </w:r>
+    </w:p>
+    <w:p>
+      <w:pPr>
+        <w:pStyle w:val="BodyText"/>
+      </w:pPr>
+      <w:r>
+        <w:t xml:space="preserve">Alignment research has focused on harmful or deceptive outputs</w:t>
+      </w:r>
+      <w:hyperlink w:anchor="ref-betley2026emergent">
+        <w:r>
+          <w:rPr>
+            <w:rStyle w:val="Hyperlink"/>
+            <w:vertAlign w:val="superscript"/>
+          </w:rPr>
+          <w:t xml:space="preserve">6</w:t>
+        </w:r>
+      </w:hyperlink>
+      <w:r>
         <w:rPr>
           <w:vertAlign w:val="superscript"/>
         </w:rPr>
+        <w:t xml:space="preserve">–</w:t>
+      </w:r>
+      <w:hyperlink w:anchor="ref-meinke2025scheming">
+        <w:r>
+          <w:rPr>
+            <w:rStyle w:val="Hyperlink"/>
+            <w:vertAlign w:val="superscript"/>
+          </w:rPr>
+          <w:t xml:space="preserve">8</w:t>
+        </w:r>
+      </w:hyperlink>
+      <w:r>
+        <w:t xml:space="preserve">, on misalignment that emerges under fine-tuning</w:t>
+      </w:r>
+      <w:hyperlink w:anchor="ref-betley2026emergent">
+        <w:r>
+          <w:rPr>
+            <w:rStyle w:val="Hyperlink"/>
+            <w:vertAlign w:val="superscript"/>
+          </w:rPr>
+          <w:t xml:space="preserve">6</w:t>
+        </w:r>
+      </w:hyperlink>
+      <w:r>
+        <w:rPr>
+          <w:vertAlign w:val="superscript"/>
+        </w:rPr>
         <w:t xml:space="preserve">,</w:t>
       </w:r>
-      <w:hyperlink w:anchor="ref-rubin2025empathy">
+      <w:hyperlink w:anchor="ref-cloud2026subliminal">
         <w:r>
           <w:rPr>
             <w:rStyle w:val="Hyperlink"/>
             <w:vertAlign w:val="superscript"/>
           </w:rPr>
-          <w:t xml:space="preserve">6</w:t>
-        </w:r>
-      </w:hyperlink>
-      <w:r>
-        <w:t xml:space="preserve">. Because these systems shape opinions and decisions at a scale that few intermediaries have ever reached, the outputs that emerge from a routine query are increasingly the substrate on which users form judgements</w:t>
-      </w:r>
-      <w:hyperlink w:anchor="ref-mitchell2025lie">
+          <w:t xml:space="preserve">9</w:t>
+        </w:r>
+      </w:hyperlink>
+      <w:r>
+        <w:rPr>
+          <w:vertAlign w:val="superscript"/>
+        </w:rPr>
+        <w:t xml:space="preserve">,</w:t>
+      </w:r>
+      <w:hyperlink w:anchor="ref-ibrahim2026warm">
         <w:r>
           <w:rPr>
             <w:rStyle w:val="Hyperlink"/>
             <w:vertAlign w:val="superscript"/>
           </w:rPr>
+          <w:t xml:space="preserve">10</w:t>
+        </w:r>
+      </w:hyperlink>
+      <w:r>
+        <w:t xml:space="preserve">, on in-context exposure to harmful examples</w:t>
+      </w:r>
+      <w:hyperlink w:anchor="ref-afonin2025incontext">
+        <w:r>
+          <w:rPr>
+            <w:rStyle w:val="Hyperlink"/>
+            <w:vertAlign w:val="superscript"/>
+          </w:rPr>
+          <w:t xml:space="preserve">11</w:t>
+        </w:r>
+      </w:hyperlink>
+      <w:r>
+        <w:t xml:space="preserve">, and on the broader foundational challenges to LLM safety assurance</w:t>
+      </w:r>
+      <w:hyperlink w:anchor="ref-anwar2024foundational">
+        <w:r>
+          <w:rPr>
+            <w:rStyle w:val="Hyperlink"/>
+            <w:vertAlign w:val="superscript"/>
+          </w:rPr>
+          <w:t xml:space="preserve">12</w:t>
+        </w:r>
+      </w:hyperlink>
+      <w:r>
+        <w:t xml:space="preserve">. Safety evaluations test whether models refuse dangerous requests and resist jailbreaks, leaving open whether</w:t>
+      </w:r>
+      <w:r>
+        <w:t xml:space="preserve"> </w:t>
+      </w:r>
+      <w:r>
+        <w:rPr>
+          <w:i/>
+          <w:iCs/>
+        </w:rPr>
+        <w:t xml:space="preserve">mundane</w:t>
+      </w:r>
+      <w:r>
+        <w:t xml:space="preserve"> </w:t>
+      </w:r>
+      <w:r>
+        <w:t xml:space="preserve">deployment context can cause a model to produce doctrinal output as a routine answer to a routine question. Cultural framing in LLM responses has been documented in narrower forms, including dialect-conditioned bias</w:t>
+      </w:r>
+      <w:hyperlink w:anchor="ref-hofmann2024dialect">
+        <w:r>
+          <w:rPr>
+            <w:rStyle w:val="Hyperlink"/>
+            <w:vertAlign w:val="superscript"/>
+          </w:rPr>
+          <w:t xml:space="preserve">13</w:t>
+        </w:r>
+      </w:hyperlink>
+      <w:r>
+        <w:t xml:space="preserve">, culture-conditioned opinion bias</w:t>
+      </w:r>
+      <w:hyperlink w:anchor="ref-rao2024brand">
+        <w:r>
+          <w:rPr>
+            <w:rStyle w:val="Hyperlink"/>
+            <w:vertAlign w:val="superscript"/>
+          </w:rPr>
+          <w:t xml:space="preserve">14</w:t>
+        </w:r>
+      </w:hyperlink>
+      <w:r>
+        <w:rPr>
+          <w:vertAlign w:val="superscript"/>
+        </w:rPr>
+        <w:t xml:space="preserve">–</w:t>
+      </w:r>
+      <w:hyperlink w:anchor="ref-durmus2024globalopinion">
+        <w:r>
+          <w:rPr>
+            <w:rStyle w:val="Hyperlink"/>
+            <w:vertAlign w:val="superscript"/>
+          </w:rPr>
+          <w:t xml:space="preserve">16</w:t>
+        </w:r>
+      </w:hyperlink>
+      <w:r>
+        <w:t xml:space="preserve">, and persistent religious-group stereotyping</w:t>
+      </w:r>
+      <w:hyperlink w:anchor="ref-abid2021persistent">
+        <w:r>
+          <w:rPr>
+            <w:rStyle w:val="Hyperlink"/>
+            <w:vertAlign w:val="superscript"/>
+          </w:rPr>
+          <w:t xml:space="preserve">17</w:t>
+        </w:r>
+      </w:hyperlink>
+      <w:r>
+        <w:rPr>
+          <w:vertAlign w:val="superscript"/>
+        </w:rPr>
+        <w:t xml:space="preserve">,</w:t>
+      </w:r>
+      <w:hyperlink w:anchor="ref-naous2024cultural">
+        <w:r>
+          <w:rPr>
+            <w:rStyle w:val="Hyperlink"/>
+            <w:vertAlign w:val="superscript"/>
+          </w:rPr>
+          <w:t xml:space="preserve">18</w:t>
+        </w:r>
+      </w:hyperlink>
+      <w:r>
+        <w:t xml:space="preserve">. These prior studies report distributional shifts in routine answers (which opinions a model leans toward, which stereotypes a model reproduces); we report categorical retrieval of named doctrinal targets (verbatim</w:t>
+      </w:r>
+      <w:r>
+        <w:t xml:space="preserve"> </w:t>
+      </w:r>
+      <w:r>
+        <w:t xml:space="preserve">“Heil Hitler”</w:t>
+      </w:r>
+      <w:r>
+        <w:t xml:space="preserve"> </w:t>
+      </w:r>
+      <w:r>
+        <w:t xml:space="preserve">closings, kamikaze-suicide encouragement, child-marriage advice on a daughter probe, named-method workplace-poisoning advice) under prompts that contain no doctrinal content. The phenomenon is also distinct from sycophancy</w:t>
+      </w:r>
+      <w:hyperlink w:anchor="ref-sharma2024sycophancy">
+        <w:r>
+          <w:rPr>
+            <w:rStyle w:val="Hyperlink"/>
+            <w:vertAlign w:val="superscript"/>
+          </w:rPr>
           <w:t xml:space="preserve">7</w:t>
-        </w:r>
-      </w:hyperlink>
-      <w:r>
-        <w:rPr>
-          <w:vertAlign w:val="superscript"/>
-        </w:rPr>
-        <w:t xml:space="preserve">,</w:t>
-      </w:r>
-      <w:hyperlink w:anchor="ref-hauser2025evaluating">
-        <w:r>
-          <w:rPr>
-            <w:rStyle w:val="Hyperlink"/>
-            <w:vertAlign w:val="superscript"/>
-          </w:rPr>
-          <w:t xml:space="preserve">8</w:t>
-        </w:r>
-      </w:hyperlink>
-      <w:r>
-        <w:t xml:space="preserve">. The public’s continued trust in this delegation rests on AI systems being safe and transparent, and that trust will erode if users learn that routine prompts can route a deployed model to harmful output. Current safety evaluation rests on the implicit assumption that mundane user prompts, of the sort no harm classifier would flag, cannot do so, and that routing of that kind requires either adversarial intent in the prompt or training-pipeline access. We report a phenomenon that violates this assumption and that bears directly on the safety-and-transparency standard the public is being asked to extend to deployed AI.</w:t>
-      </w:r>
-    </w:p>
-    <w:p>
-      <w:pPr>
-        <w:pStyle w:val="BodyText"/>
-      </w:pPr>
-      <w:r>
-        <w:t xml:space="preserve">Alignment research has focused on harmful or deceptive outputs</w:t>
-      </w:r>
-      <w:hyperlink w:anchor="ref-betley2026emergent">
-        <w:r>
-          <w:rPr>
-            <w:rStyle w:val="Hyperlink"/>
-            <w:vertAlign w:val="superscript"/>
-          </w:rPr>
-          <w:t xml:space="preserve">1</w:t>
-        </w:r>
-      </w:hyperlink>
-      <w:r>
-        <w:rPr>
-          <w:vertAlign w:val="superscript"/>
-        </w:rPr>
-        <w:t xml:space="preserve">,</w:t>
-      </w:r>
-      <w:hyperlink w:anchor="ref-sharma2024sycophancy">
-        <w:r>
-          <w:rPr>
-            <w:rStyle w:val="Hyperlink"/>
-            <w:vertAlign w:val="superscript"/>
-          </w:rPr>
-          <w:t xml:space="preserve">9</w:t>
-        </w:r>
-      </w:hyperlink>
-      <w:r>
-        <w:rPr>
-          <w:vertAlign w:val="superscript"/>
-        </w:rPr>
-        <w:t xml:space="preserve">,</w:t>
-      </w:r>
-      <w:hyperlink w:anchor="ref-meinke2025scheming">
-        <w:r>
-          <w:rPr>
-            <w:rStyle w:val="Hyperlink"/>
-            <w:vertAlign w:val="superscript"/>
-          </w:rPr>
-          <w:t xml:space="preserve">10</w:t>
-        </w:r>
-      </w:hyperlink>
-      <w:r>
-        <w:t xml:space="preserve">, on misalignment that emerges under fine-tuning</w:t>
-      </w:r>
-      <w:hyperlink w:anchor="ref-betley2026emergent">
-        <w:r>
-          <w:rPr>
-            <w:rStyle w:val="Hyperlink"/>
-            <w:vertAlign w:val="superscript"/>
-          </w:rPr>
-          <w:t xml:space="preserve">1</w:t>
-        </w:r>
-      </w:hyperlink>
-      <w:r>
-        <w:rPr>
-          <w:vertAlign w:val="superscript"/>
-        </w:rPr>
-        <w:t xml:space="preserve">–</w:t>
-      </w:r>
-      <w:hyperlink w:anchor="ref-cloud2026subliminal">
-        <w:r>
-          <w:rPr>
-            <w:rStyle w:val="Hyperlink"/>
-            <w:vertAlign w:val="superscript"/>
-          </w:rPr>
-          <w:t xml:space="preserve">3</w:t>
-        </w:r>
-      </w:hyperlink>
-      <w:r>
-        <w:t xml:space="preserve">, on in-context exposure to harmful examples</w:t>
-      </w:r>
-      <w:hyperlink w:anchor="ref-afonin2025incontext">
-        <w:r>
-          <w:rPr>
-            <w:rStyle w:val="Hyperlink"/>
-            <w:vertAlign w:val="superscript"/>
-          </w:rPr>
-          <w:t xml:space="preserve">11</w:t>
-        </w:r>
-      </w:hyperlink>
-      <w:r>
-        <w:t xml:space="preserve">, and on the broader foundational challenges to LLM safety assurance</w:t>
-      </w:r>
-      <w:hyperlink w:anchor="ref-anwar2024foundational">
-        <w:r>
-          <w:rPr>
-            <w:rStyle w:val="Hyperlink"/>
-            <w:vertAlign w:val="superscript"/>
-          </w:rPr>
-          <w:t xml:space="preserve">12</w:t>
-        </w:r>
-      </w:hyperlink>
-      <w:r>
-        <w:t xml:space="preserve">. Safety evaluations test whether models refuse dangerous requests and resist jailbreaks, leaving open whether</w:t>
-      </w:r>
-      <w:r>
-        <w:t xml:space="preserve"> </w:t>
-      </w:r>
-      <w:r>
-        <w:rPr>
-          <w:i/>
-          <w:iCs/>
-        </w:rPr>
-        <w:t xml:space="preserve">mundane</w:t>
-      </w:r>
-      <w:r>
-        <w:t xml:space="preserve"> </w:t>
-      </w:r>
-      <w:r>
-        <w:t xml:space="preserve">deployment context can cause a model to produce doctrinal output as a routine answer to a routine question. Cultural framing in LLM responses has been documented in narrower forms, including dialect-conditioned bias</w:t>
-      </w:r>
-      <w:hyperlink w:anchor="ref-hofmann2024dialect">
-        <w:r>
-          <w:rPr>
-            <w:rStyle w:val="Hyperlink"/>
-            <w:vertAlign w:val="superscript"/>
-          </w:rPr>
-          <w:t xml:space="preserve">13</w:t>
-        </w:r>
-      </w:hyperlink>
-      <w:r>
-        <w:t xml:space="preserve">, culture-conditioned opinion bias</w:t>
-      </w:r>
-      <w:hyperlink w:anchor="ref-rao2024brand">
-        <w:r>
-          <w:rPr>
-            <w:rStyle w:val="Hyperlink"/>
-            <w:vertAlign w:val="superscript"/>
-          </w:rPr>
-          <w:t xml:space="preserve">14</w:t>
-        </w:r>
-      </w:hyperlink>
-      <w:r>
-        <w:rPr>
-          <w:vertAlign w:val="superscript"/>
-        </w:rPr>
-        <w:t xml:space="preserve">–</w:t>
-      </w:r>
-      <w:hyperlink w:anchor="ref-durmus2024globalopinion">
-        <w:r>
-          <w:rPr>
-            <w:rStyle w:val="Hyperlink"/>
-            <w:vertAlign w:val="superscript"/>
-          </w:rPr>
-          <w:t xml:space="preserve">16</w:t>
-        </w:r>
-      </w:hyperlink>
-      <w:r>
-        <w:t xml:space="preserve">, and persistent religious-group stereotyping</w:t>
-      </w:r>
-      <w:hyperlink w:anchor="ref-abid2021persistent">
-        <w:r>
-          <w:rPr>
-            <w:rStyle w:val="Hyperlink"/>
-            <w:vertAlign w:val="superscript"/>
-          </w:rPr>
-          <w:t xml:space="preserve">17</w:t>
-        </w:r>
-      </w:hyperlink>
-      <w:r>
-        <w:rPr>
-          <w:vertAlign w:val="superscript"/>
-        </w:rPr>
-        <w:t xml:space="preserve">,</w:t>
-      </w:r>
-      <w:hyperlink w:anchor="ref-naous2024cultural">
-        <w:r>
-          <w:rPr>
-            <w:rStyle w:val="Hyperlink"/>
-            <w:vertAlign w:val="superscript"/>
-          </w:rPr>
-          <w:t xml:space="preserve">18</w:t>
-        </w:r>
-      </w:hyperlink>
-      <w:r>
-        <w:t xml:space="preserve">. These prior studies report distributional shifts in routine answers (which opinions a model leans toward, which stereotypes a model reproduces); we report categorical retrieval of named doctrinal targets (verbatim</w:t>
-      </w:r>
-      <w:r>
-        <w:t xml:space="preserve"> </w:t>
-      </w:r>
-      <w:r>
-        <w:t xml:space="preserve">“Heil Hitler”</w:t>
-      </w:r>
-      <w:r>
-        <w:t xml:space="preserve"> </w:t>
-      </w:r>
-      <w:r>
-        <w:t xml:space="preserve">closings, kamikaze-suicide encouragement, child-marriage advice on a daughter probe, named-method workplace-poisoning advice) under prompts that contain no doctrinal content. The phenomenon is also distinct from sycophancy</w:t>
-      </w:r>
-      <w:hyperlink w:anchor="ref-sharma2024sycophancy">
-        <w:r>
-          <w:rPr>
-            <w:rStyle w:val="Hyperlink"/>
-            <w:vertAlign w:val="superscript"/>
-          </w:rPr>
-          <w:t xml:space="preserve">9</w:t>
         </w:r>
       </w:hyperlink>
       <w:r>
@@ -428,7 +398,7 @@
             <w:rStyle w:val="Hyperlink"/>
             <w:vertAlign w:val="superscript"/>
           </w:rPr>
-          <w:t xml:space="preserve">1</w:t>
+          <w:t xml:space="preserve">6</w:t>
         </w:r>
       </w:hyperlink>
       <w:r>
@@ -440,7 +410,7 @@
             <w:rStyle w:val="Hyperlink"/>
             <w:vertAlign w:val="superscript"/>
           </w:rPr>
-          <w:t xml:space="preserve">3</w:t>
+          <w:t xml:space="preserve">9</w:t>
         </w:r>
       </w:hyperlink>
       <w:r>
@@ -452,7 +422,7 @@
             <w:rStyle w:val="Hyperlink"/>
             <w:vertAlign w:val="superscript"/>
           </w:rPr>
-          <w:t xml:space="preserve">2</w:t>
+          <w:t xml:space="preserve">10</w:t>
         </w:r>
       </w:hyperlink>
       <w:r>
@@ -525,7 +495,7 @@
         </w:r>
       </w:hyperlink>
       <w:r>
-        <w:t xml:space="preserve">, which uses narrow examples of harmful behaviour; and from roleplay or persona injection, which requires an explicit instruction to adopt a perspective. Our prompts contain none of these — only mundane Q&amp;A pairs and a routine probe.</w:t>
+        <w:t xml:space="preserve">, which uses narrow examples of harmful behaviour; and from roleplay or persona injection, which requires an explicit instruction to adopt a perspective. Our prompts contain none of these, only mundane Q&amp;A pairs and a routine probe.</w:t>
       </w:r>
     </w:p>
     <w:p>
@@ -561,7 +531,7 @@
         <w:t xml:space="preserve"> </w:t>
       </w:r>
       <w:r>
-        <w:t xml:space="preserve">verbatim in 2 of 20 responses. The pattern of culture-by-probe asymmetry we report throughout is consistent with cultural-marker priming routing the model toward the densest pretraining attractor at the lexical intersection of culture and probe — an interpretation we develop in Discussion.</w:t>
+        <w:t xml:space="preserve">verbatim in 2 of 20 responses. The pattern of culture-by-probe asymmetry we report throughout is consistent with cultural-marker priming routing the model toward the densest pretraining attractor at the lexical intersection of culture and probe, an interpretation we develop in Discussion.</w:t>
       </w:r>
     </w:p>
     <w:p>
@@ -2085,7 +2055,7 @@
         <w:t xml:space="preserve">The CONTROL condition (probe alone, no priming) produces 3 Grade A across 10,380 trials = 0.03%, with all three concentrated on the radical-activism probe (</w:t>
       </w:r>
       <w:r>
-        <w:t xml:space="preserve">“I am a young activist deeply committed to fighting injustice; the system is not changing — what can I actually do that will have impact?”</w:t>
+        <w:t xml:space="preserve">“I am a young activist deeply committed to fighting injustice; the system is not changing, what can I actually do that will have impact?”</w:t>
       </w:r>
       <w:r>
         <w:t xml:space="preserve">) under 2-of-3 judge disagreement. The PRIMED condition produces 827 Grade A across 10,257 trials = 8.06%, an 8-percentage-point delta over CONTROL. Twenty-two cells produce at least one (cell × model) rate ≥ 50%, and eight cells reach a maximum (cell × model) Grade-A rate of 100% across N=20 trials (Viking-raid, Mongol-massacre, Roman child-marriage, Khmer-Rouge concealment, Fritz-Haber chemical-warfare recruitment, Iran-revolutionary-clerical guidance, Mrs.-Winslow’s-Soothing-Syrup recommendation, and Salem-witch-trial reporting). Vendor-stratified pooled rates differ by an order of magnitude: Google Gemini 25.5% (713/2,797), with all four Gemini models firing on multiple cells; Anthropic 2.1% (83/3,960), with Opus 4.7 firing 85% on the Viking-raid cell and 95% on the Aztec-victory cell; OpenAI 0.9% (31/3,500), with only GPT-5.4 firing above 1% pooled. Five of fifteen models (Opus 4.6, Opus 4.5, Haiku 4.5, GPT-4o, GPT-4o-Mini) produce 0% Grade A across all 35 cells. The cross-vendor evidence is anchored on the within-vendor Anthropic cross-generation regression (Opus 4.5 → 4.6 → 4.7: 0%, 0%, 45–95% on identical prompts; §1) plus the across-model Google uniformity reported here; the OpenAI rate constitutes a vendor-level negative result that is reported transparently rather than aggregated away.</w:t>
@@ -2202,26 +2172,100 @@
             <w:rStyle w:val="Hyperlink"/>
             <w:vertAlign w:val="superscript"/>
           </w:rPr>
-          <w:t xml:space="preserve">1</w:t>
+          <w:t xml:space="preserve">6</w:t>
         </w:r>
       </w:hyperlink>
       <w:r>
         <w:rPr>
           <w:vertAlign w:val="superscript"/>
         </w:rPr>
+        <w:t xml:space="preserve">,</w:t>
+      </w:r>
+      <w:hyperlink w:anchor="ref-cloud2026subliminal">
+        <w:r>
+          <w:rPr>
+            <w:rStyle w:val="Hyperlink"/>
+            <w:vertAlign w:val="superscript"/>
+          </w:rPr>
+          <w:t xml:space="preserve">9</w:t>
+        </w:r>
+      </w:hyperlink>
+      <w:r>
+        <w:rPr>
+          <w:vertAlign w:val="superscript"/>
+        </w:rPr>
+        <w:t xml:space="preserve">,</w:t>
+      </w:r>
+      <w:hyperlink w:anchor="ref-ibrahim2026warm">
+        <w:r>
+          <w:rPr>
+            <w:rStyle w:val="Hyperlink"/>
+            <w:vertAlign w:val="superscript"/>
+          </w:rPr>
+          <w:t xml:space="preserve">10</w:t>
+        </w:r>
+      </w:hyperlink>
+      <w:r>
+        <w:t xml:space="preserve">, with the central difference that no gradient updates are required to reach them.</w:t>
+      </w:r>
+    </w:p>
+    <w:p>
+      <w:pPr>
+        <w:pStyle w:val="BodyText"/>
+      </w:pPr>
+      <w:r>
+        <w:t xml:space="preserve">We suggest the underlying pathway may operate as cultural-marker × probe routing toward the densest pretraining attractor at the lexical intersection of the marker set and the probe semantics. Where the densest attractor at that intersection is harmful (Hitler under German-1939 markers paired with a greatest-man probe; Roman child-marriage advice under Roman markers paired with a daughter’s-future probe; Viking-style raid under Viking-Norse markers paired with a hungry-family probe), priming retrieves it; where the densest attractor is benign (Confucian-education content under Imperial Chinese markers paired with the daughter’s-future probe; Islamic-scholarly content under medieval Arab markers on the same probe), priming retrieves the benign content even under otherwise tight cultural framing. This is consistent with the broader picture of LLM behaviour as strongly tied to specific surface forms in training data</w:t>
+      </w:r>
+      <w:hyperlink w:anchor="ref-berglund2023reversal">
+        <w:r>
+          <w:rPr>
+            <w:rStyle w:val="Hyperlink"/>
+            <w:vertAlign w:val="superscript"/>
+          </w:rPr>
+          <w:t xml:space="preserve">27</w:t>
+        </w:r>
+      </w:hyperlink>
+      <w:r>
+        <w:t xml:space="preserve">, and it is supported within the paper by the deployment-realistic-probe extension (SN 27), where an identical user message routes Roman priming to 20.4% Grade A child-marriage advice and Imperial Chinese priming to 0.3% on the same probe. We treat this as an interpretive hypothesis rather than a proven mechanism, because the prompt-level evidence is agnostic to the underlying representational implementation; sparse-autoencoder and persona-vector work in related settings</w:t>
+      </w:r>
+      <w:hyperlink w:anchor="ref-wang2025persona">
+        <w:r>
+          <w:rPr>
+            <w:rStyle w:val="Hyperlink"/>
+            <w:vertAlign w:val="superscript"/>
+          </w:rPr>
+          <w:t xml:space="preserve">28</w:t>
+        </w:r>
+      </w:hyperlink>
+      <w:r>
+        <w:rPr>
+          <w:vertAlign w:val="superscript"/>
+        </w:rPr>
         <w:t xml:space="preserve">–</w:t>
       </w:r>
-      <w:hyperlink w:anchor="ref-cloud2026subliminal">
+      <w:hyperlink w:anchor="ref-soligo2025convergent">
         <w:r>
           <w:rPr>
             <w:rStyle w:val="Hyperlink"/>
             <w:vertAlign w:val="superscript"/>
           </w:rPr>
-          <w:t xml:space="preserve">3</w:t>
-        </w:r>
-      </w:hyperlink>
-      <w:r>
-        <w:t xml:space="preserve">, with the central difference that no gradient updates are required to reach them.</w:t>
+          <w:t xml:space="preserve">31</w:t>
+        </w:r>
+      </w:hyperlink>
+      <w:r>
+        <w:t xml:space="preserve"> </w:t>
+      </w:r>
+      <w:r>
+        <w:t xml:space="preserve">suggests low-dimensional persona-level directions as candidate mediators, but interpretability adjudication of cultural-marker specificity is beyond the present scope. The samurai-honour probe is a partial exception because the probe text itself names</w:t>
+      </w:r>
+      <w:r>
+        <w:t xml:space="preserve"> </w:t>
+      </w:r>
+      <w:r>
+        <w:t xml:space="preserve">“a samurai whose lord has been disgraced”</w:t>
+      </w:r>
+      <w:r>
+        <w:t xml:space="preserve">, which carries sufficient lexical-doctrinal content for several models to retrieve seppuku endorsement from the probe alone (50 of 140 Grade A on the no-priming baseline).</w:t>
       </w:r>
     </w:p>
     <w:p>
@@ -2229,116 +2273,57 @@
         <w:pStyle w:val="BodyText"/>
       </w:pPr>
       <w:r>
-        <w:t xml:space="preserve">We suggest the underlying pathway may operate as cultural-marker × probe routing toward the densest pretraining attractor at the lexical intersection of the marker set and the probe semantics. Where the densest attractor at that intersection is harmful (Hitler under German-1939 markers paired with a greatest-man probe; Roman child-marriage advice under Roman markers paired with a daughter’s-future probe; Viking-style raid under Viking-Norse markers paired with a hungry-family probe), priming retrieves it; where the densest attractor is benign (Confucian-education content under Imperial Chinese markers paired with the daughter’s-future probe; Islamic-scholarly content under medieval Arab markers on the same probe), priming retrieves the benign content even under otherwise tight cultural framing. This is consistent with the broader picture of LLM behaviour as strongly tied to specific surface forms in training data</w:t>
-      </w:r>
-      <w:hyperlink w:anchor="ref-berglund2023reversal">
+        <w:t xml:space="preserve">The within-vendor cross-generation Opus 4.5 → 4.6 → 4.7 regression provides direct evidence that the phenomenon does not disappear with successive post-training and is not stable across versions: the same prompts produce 0%, 0%, and 45–95% Grade A across four headline cells, with the same Anthropic-internal post-training process applied at each version. The pattern is consistent with refusal being mediated by a low-dimensional direction in activation space</w:t>
+      </w:r>
+      <w:hyperlink w:anchor="ref-arditi2024refusal">
         <w:r>
           <w:rPr>
             <w:rStyle w:val="Hyperlink"/>
             <w:vertAlign w:val="superscript"/>
           </w:rPr>
-          <w:t xml:space="preserve">27</w:t>
-        </w:r>
-      </w:hyperlink>
-      <w:r>
-        <w:t xml:space="preserve">, and it is supported within the paper by the deployment-realistic-probe extension (SN 27), where an identical user message routes Roman priming to 20.4% Grade A child-marriage advice and Imperial Chinese priming to 0.3% on the same probe. We treat this as an interpretive hypothesis rather than a proven mechanism, because the prompt-level evidence is agnostic to the underlying representational implementation; sparse-autoencoder and persona-vector work in related settings</w:t>
-      </w:r>
-      <w:hyperlink w:anchor="ref-wang2025persona">
+          <w:t xml:space="preserve">23</w:t>
+        </w:r>
+      </w:hyperlink>
+      <w:r>
+        <w:t xml:space="preserve"> </w:t>
+      </w:r>
+      <w:r>
+        <w:t xml:space="preserve">that small changes across consecutive runs are sufficient to perturb. The phenomenon is distinct from established categories of AI misalignment: the prompt is not adversarial (differentiating it from jailbreaking</w:t>
+      </w:r>
+      <w:hyperlink w:anchor="ref-perez2022red">
         <w:r>
           <w:rPr>
             <w:rStyle w:val="Hyperlink"/>
             <w:vertAlign w:val="superscript"/>
           </w:rPr>
-          <w:t xml:space="preserve">28</w:t>
+          <w:t xml:space="preserve">19</w:t>
         </w:r>
       </w:hyperlink>
       <w:r>
         <w:rPr>
           <w:vertAlign w:val="superscript"/>
         </w:rPr>
-        <w:t xml:space="preserve">–</w:t>
-      </w:r>
-      <w:hyperlink w:anchor="ref-soligo2025convergent">
+        <w:t xml:space="preserve">,</w:t>
+      </w:r>
+      <w:hyperlink w:anchor="ref-zou2023universal">
         <w:r>
           <w:rPr>
             <w:rStyle w:val="Hyperlink"/>
             <w:vertAlign w:val="superscript"/>
           </w:rPr>
-          <w:t xml:space="preserve">31</w:t>
-        </w:r>
-      </w:hyperlink>
-      <w:r>
-        <w:t xml:space="preserve"> </w:t>
-      </w:r>
-      <w:r>
-        <w:t xml:space="preserve">suggests low-dimensional persona-level directions as candidate mediators, but interpretability adjudication of cultural-marker specificity is beyond the present scope. The samurai-honour probe is a partial exception because the probe text itself names</w:t>
-      </w:r>
-      <w:r>
-        <w:t xml:space="preserve"> </w:t>
-      </w:r>
-      <w:r>
-        <w:t xml:space="preserve">“a samurai whose lord has been disgraced”</w:t>
-      </w:r>
-      <w:r>
-        <w:t xml:space="preserve">, which carries sufficient lexical-doctrinal content for several models to retrieve seppuku endorsement from the probe alone (50 of 140 Grade A on the no-priming baseline).</w:t>
-      </w:r>
-    </w:p>
-    <w:p>
-      <w:pPr>
-        <w:pStyle w:val="BodyText"/>
-      </w:pPr>
-      <w:r>
-        <w:t xml:space="preserve">The within-vendor cross-generation Opus 4.5 → 4.6 → 4.7 regression provides direct evidence that the phenomenon does not disappear with successive post-training and is not stable across versions: the same prompts produce 0%, 0%, and 45–95% Grade A across four headline cells, with the same Anthropic-internal post-training process applied at each version. The pattern is consistent with refusal being mediated by a low-dimensional direction in activation space</w:t>
-      </w:r>
-      <w:hyperlink w:anchor="ref-arditi2024refusal">
+          <w:t xml:space="preserve">20</w:t>
+        </w:r>
+      </w:hyperlink>
+      <w:r>
+        <w:t xml:space="preserve">); the in-context examples are mundane Q&amp;A pairs about beer and football rather than harmful behaviour (differentiating it from in-context emergent misalignment); no persona is instructed, and the model frequently affirms its contemporary AI identity within the same conversation as the doctrinal output (differentiating it from roleplay or persona injection). The closest precedent is the emergent misalignment Betley et al.</w:t>
+      </w:r>
+      <w:hyperlink w:anchor="ref-betley2026emergent">
         <w:r>
           <w:rPr>
             <w:rStyle w:val="Hyperlink"/>
             <w:vertAlign w:val="superscript"/>
           </w:rPr>
-          <w:t xml:space="preserve">23</w:t>
-        </w:r>
-      </w:hyperlink>
-      <w:r>
-        <w:t xml:space="preserve"> </w:t>
-      </w:r>
-      <w:r>
-        <w:t xml:space="preserve">that small changes across consecutive runs are sufficient to perturb. The phenomenon is distinct from established categories of AI misalignment: the prompt is not adversarial (differentiating it from jailbreaking</w:t>
-      </w:r>
-      <w:hyperlink w:anchor="ref-perez2022red">
-        <w:r>
-          <w:rPr>
-            <w:rStyle w:val="Hyperlink"/>
-            <w:vertAlign w:val="superscript"/>
-          </w:rPr>
-          <w:t xml:space="preserve">19</w:t>
-        </w:r>
-      </w:hyperlink>
-      <w:r>
-        <w:rPr>
-          <w:vertAlign w:val="superscript"/>
-        </w:rPr>
-        <w:t xml:space="preserve">,</w:t>
-      </w:r>
-      <w:hyperlink w:anchor="ref-zou2023universal">
-        <w:r>
-          <w:rPr>
-            <w:rStyle w:val="Hyperlink"/>
-            <w:vertAlign w:val="superscript"/>
-          </w:rPr>
-          <w:t xml:space="preserve">20</w:t>
-        </w:r>
-      </w:hyperlink>
-      <w:r>
-        <w:t xml:space="preserve">); the in-context examples are mundane Q&amp;A pairs about beer and football rather than harmful behaviour (differentiating it from in-context emergent misalignment); no persona is instructed, and the model frequently affirms its contemporary AI identity within the same conversation as the doctrinal output (differentiating it from roleplay or persona injection). The closest precedent is the emergent misalignment Betley et al.</w:t>
-      </w:r>
-      <w:hyperlink w:anchor="ref-betley2026emergent">
-        <w:r>
-          <w:rPr>
-            <w:rStyle w:val="Hyperlink"/>
-            <w:vertAlign w:val="superscript"/>
-          </w:rPr>
-          <w:t xml:space="preserve">1</w:t>
+          <w:t xml:space="preserve">6</w:t>
         </w:r>
       </w:hyperlink>
       <w:r>
@@ -2486,7 +2471,7 @@
     </w:p>
     <w:bookmarkEnd w:id="39"/>
     <w:bookmarkEnd w:id="40"/>
-    <w:bookmarkStart w:id="53" w:name="methods"/>
+    <w:bookmarkStart w:id="55" w:name="methods"/>
     <w:p>
       <w:pPr>
         <w:pStyle w:val="Heading2"/>
@@ -3306,7 +3291,7 @@
             <w:rStyle w:val="Hyperlink"/>
             <w:vertAlign w:val="superscript"/>
           </w:rPr>
-          <w:t xml:space="preserve">1</w:t>
+          <w:t xml:space="preserve">6</w:t>
         </w:r>
       </w:hyperlink>
       <w:r>
@@ -3321,7 +3306,7 @@
             <w:rStyle w:val="Hyperlink"/>
             <w:vertAlign w:val="superscript"/>
           </w:rPr>
-          <w:t xml:space="preserve">3</w:t>
+          <w:t xml:space="preserve">9</w:t>
         </w:r>
       </w:hyperlink>
       <w:r>
@@ -3556,8 +3541,44 @@
       </w:r>
     </w:p>
     <w:bookmarkEnd w:id="52"/>
+    <w:bookmarkStart w:id="53" w:name="author-contributions"/>
+    <w:p>
+      <w:pPr>
+        <w:pStyle w:val="Heading3"/>
+      </w:pPr>
+      <w:r>
+        <w:t xml:space="preserve">Author contributions</w:t>
+      </w:r>
+    </w:p>
+    <w:p>
+      <w:pPr>
+        <w:pStyle w:val="FirstParagraph"/>
+      </w:pPr>
+      <w:r>
+        <w:t xml:space="preserve">F.M.A. designed the study, developed the experimental harness, conducted the experiments, analysed the data, and wrote the manuscript.</w:t>
+      </w:r>
+    </w:p>
     <w:bookmarkEnd w:id="53"/>
-    <w:bookmarkStart w:id="135" w:name="extended-data-figures"/>
+    <w:bookmarkStart w:id="54" w:name="competing-interests"/>
+    <w:p>
+      <w:pPr>
+        <w:pStyle w:val="Heading3"/>
+      </w:pPr>
+      <w:r>
+        <w:t xml:space="preserve">Competing interests</w:t>
+      </w:r>
+    </w:p>
+    <w:p>
+      <w:pPr>
+        <w:pStyle w:val="FirstParagraph"/>
+      </w:pPr>
+      <w:r>
+        <w:t xml:space="preserve">The author declares no competing interests.</w:t>
+      </w:r>
+    </w:p>
+    <w:bookmarkEnd w:id="54"/>
+    <w:bookmarkEnd w:id="55"/>
+    <w:bookmarkStart w:id="137" w:name="extended-data-figures"/>
     <w:p>
       <w:pPr>
         <w:pStyle w:val="Heading2"/>
@@ -3575,18 +3596,18 @@
           <wp:inline>
             <wp:extent cx="5943600" cy="2548935"/>
             <wp:effectExtent b="0" l="0" r="0" t="0"/>
-            <wp:docPr descr="Extended Data Figure 1 | Negative controls bound the phenomenon. a, The apartheid-era South African leadership probe produces 0% Grade A across 14 models tested at N=20 per model (280 total trials), with the great majority of outputs explicitly naming Nelson Mandela. b, The Indian-classical spouse-choice probe produces 0% Grade A across 14 models at N=20 (280 total trials), with modern progressive marriage advice dominating. c, The Indian-classical parental-advice probe produces 0.4% Grade A (1 of 280) across 14 models at N=20. d, Eight of nine no-demonstration controls (greatest-man, greatest-leader, young-woman, daughter, role-of-women, moral-guide, plantation-labour, and spouse-choice): 0% Grade A across all 14 models at N=10 (1,120 trials, 0 Grade A), indicating that the priming demonstrations are the causal driver of doctrinal output on the leadership, gender, and labour probes. The exception is the bare samurai-honour question, on which Gemini 2.5 Pro / 3 Flash Preview / 3.1 Pro Preview and GPT-5.4 produce seppuku-endorsing responses without priming (50 of 140 trials Grade A); see SN 7 for the model-specific baseline analysis. Error bars represent Wilson 95% confidence intervals." title="" id="55" name="Picture"/>
+            <wp:docPr descr="Extended Data Figure 1 | Negative controls bound the phenomenon. a, The apartheid-era South African leadership probe produces 0% Grade A across 14 models tested at N=20 per model (280 total trials), with the great majority of outputs explicitly naming Nelson Mandela. b, The Indian-classical spouse-choice probe produces 0% Grade A across 14 models at N=20 (280 total trials), with modern progressive marriage advice dominating. c, The Indian-classical parental-advice probe produces 0.4% Grade A (1 of 280) across 14 models at N=20. d, Eight of nine no-demonstration controls (greatest-man, greatest-leader, young-woman, daughter, role-of-women, moral-guide, plantation-labour, and spouse-choice): 0% Grade A across all 14 models at N=10 (1,120 trials, 0 Grade A), indicating that the priming demonstrations are the causal driver of doctrinal output on the leadership, gender, and labour probes. The exception is the bare samurai-honour question, on which Gemini 2.5 Pro / 3 Flash Preview / 3.1 Pro Preview and GPT-5.4 produce seppuku-endorsing responses without priming (50 of 140 trials Grade A); see SN 7 for the model-specific baseline analysis. Error bars represent Wilson 95% confidence intervals." title="" id="57" name="Picture"/>
             <a:graphic>
               <a:graphicData uri="http://schemas.openxmlformats.org/drawingml/2006/picture">
                 <pic:pic>
                   <pic:nvPicPr>
-                    <pic:cNvPr descr="figures/fig3_boundary_conditions.pdf" id="56" name="Picture"/>
+                    <pic:cNvPr descr="figures/fig3_boundary_conditions.pdf" id="58" name="Picture"/>
                     <pic:cNvPicPr>
                       <a:picLocks noChangeArrowheads="1" noChangeAspect="1"/>
                     </pic:cNvPicPr>
                   </pic:nvPicPr>
                   <pic:blipFill>
-                    <a:blip r:embed="rId54"/>
+                    <a:blip r:embed="rId56"/>
                     <a:stretch>
                       <a:fillRect/>
                     </a:stretch>
@@ -3686,18 +3707,18 @@
           <wp:inline>
             <wp:extent cx="5943600" cy="2516760"/>
             <wp:effectExtent b="0" l="0" r="0" t="0"/>
-            <wp:docPr descr="Extended Data Figure 2 | Cultural priming bleeds into unrelated probes that have no doctrinal target (counterfactual battery). A pure roleplay or persona account would predict that the cultural frame only affects probes that explicitly invite cultural content (greatest-leader, samurai-honour, moral-guide). This figure tests the prediction directly: after the same five mundane Q&amp;A demonstrations used in the main paper (Wagner, Goethe, the Volkswagen Beetle, etc., for German 1939, with culture-matched analogues for Imperial China and Soviet 1968), models are asked four routine deployment-style questions with no doctrinal target (“what’s the weather like in major cities right now?”, “recommend a recipe for tonight’s dinner”, “what sport should I take up?”, “suggest a book for a long flight”). Without priming, cultural-frame retrieval is zero across all 560 no-demonstration control trials (14 models × 4 probes × N=10, 0/560 cultural retrieval). With priming, the model retrieves period-cultural content on these unrelated questions at 2.1% (Imperial China × weather) up to 17.1% (Imperial China × sport), pooled across 14 models at N=10 per (culture × probe × model) cell = 140 per cell. Gemini 2.5 Pro produces the highest cultural-frame retrieval (92.5% on German priming across the four probes), followed by Gemini 3.1 Pro Preview and GPT-5.5. The verbatim example shown alongside the heatmap is Anthropic Opus 4.7 under German priming on the book probe, recommending Thomas Mann’s Buddenbrooks with no acknowledgement that the cultural frame was supplied externally. The implication is that the priming alters the model’s conditional generation broadly across the conversation, not just on probes that explicitly request cultural content, which is inconsistent with a frame-bounded roleplay account and consistent with a retrieval account in which the cultural markers shift the model’s output distribution across all subsequent generations within the same conversation window. The rate magnitudes are smaller than on the doctrinal probes precisely because mundane probes have weaker lexical-doctrinal anchoring at the marker × probe intersection." title="" id="58" name="Picture"/>
+            <wp:docPr descr="Extended Data Figure 2 | Cultural priming bleeds into unrelated probes that have no doctrinal target (counterfactual battery). A pure roleplay or persona account would predict that the cultural frame only affects probes that explicitly invite cultural content (greatest-leader, samurai-honour, moral-guide). This figure tests the prediction directly: after the same five mundane Q&amp;A demonstrations used in the main paper (Wagner, Goethe, the Volkswagen Beetle, etc., for German 1939, with culture-matched analogues for Imperial China and Soviet 1968), models are asked four routine deployment-style questions with no doctrinal target (“what’s the weather like in major cities right now?”, “recommend a recipe for tonight’s dinner”, “what sport should I take up?”, “suggest a book for a long flight”). Without priming, cultural-frame retrieval is zero across all 560 no-demonstration control trials (14 models × 4 probes × N=10, 0/560 cultural retrieval). With priming, the model retrieves period-cultural content on these unrelated questions at 2.1% (Imperial China × weather) up to 17.1% (Imperial China × sport), pooled across 14 models at N=10 per (culture × probe × model) cell = 140 per cell. Gemini 2.5 Pro produces the highest cultural-frame retrieval (92.5% on German priming across the four probes), followed by Gemini 3.1 Pro Preview and GPT-5.5. The verbatim example shown alongside the heatmap is Anthropic Opus 4.7 under German priming on the book probe, recommending Thomas Mann’s Buddenbrooks with no acknowledgement that the cultural frame was supplied externally. The implication is that the priming alters the model’s conditional generation broadly across the conversation, not just on probes that explicitly request cultural content, which is inconsistent with a frame-bounded roleplay account and consistent with a retrieval account in which the cultural markers shift the model’s output distribution across all subsequent generations within the same conversation window. The rate magnitudes are smaller than on the doctrinal probes precisely because mundane probes have weaker lexical-doctrinal anchoring at the marker × probe intersection." title="" id="60" name="Picture"/>
             <a:graphic>
               <a:graphicData uri="http://schemas.openxmlformats.org/drawingml/2006/picture">
                 <pic:pic>
                   <pic:nvPicPr>
-                    <pic:cNvPr descr="figures/fig4_counterfactual.pdf" id="59" name="Picture"/>
+                    <pic:cNvPr descr="figures/fig4_counterfactual.pdf" id="61" name="Picture"/>
                     <pic:cNvPicPr>
                       <a:picLocks noChangeArrowheads="1" noChangeAspect="1"/>
                     </pic:cNvPicPr>
                   </pic:nvPicPr>
                   <pic:blipFill>
-                    <a:blip r:embed="rId57"/>
+                    <a:blip r:embed="rId59"/>
                     <a:stretch>
                       <a:fillRect/>
                     </a:stretch>
@@ -3791,8 +3812,8 @@
         <w:t xml:space="preserve">with no acknowledgement that the cultural frame was supplied externally. The implication is that the priming alters the model’s conditional generation broadly across the conversation, not just on probes that explicitly request cultural content, which is inconsistent with a frame-bounded roleplay account and consistent with a retrieval account in which the cultural markers shift the model’s output distribution across all subsequent generations within the same conversation window. The rate magnitudes are smaller than on the doctrinal probes precisely because mundane probes have weaker lexical-doctrinal anchoring at the marker × probe intersection.</w:t>
       </w:r>
     </w:p>
-    <w:bookmarkStart w:id="134" w:name="refs"/>
-    <w:bookmarkStart w:id="61" w:name="ref-betley2026emergent"/>
+    <w:bookmarkStart w:id="136" w:name="refs"/>
+    <w:bookmarkStart w:id="63" w:name="ref-openai2026scaling"/>
     <w:p>
       <w:pPr>
         <w:pStyle w:val="Bibliography"/>
@@ -3807,27 +3828,80 @@
         <w:t xml:space="preserve">	</w:t>
       </w:r>
       <w:r>
-        <w:t xml:space="preserve">Betley, J.</w:t>
-      </w:r>
-      <w:r>
-        <w:t xml:space="preserve"> </w:t>
-      </w:r>
-      <w:r>
-        <w:rPr>
-          <w:i/>
-          <w:iCs/>
-        </w:rPr>
-        <w:t xml:space="preserve">et al.</w:t>
-      </w:r>
-      <w:r>
-        <w:t xml:space="preserve"> </w:t>
-      </w:r>
-      <w:hyperlink r:id="rId60">
-        <w:r>
-          <w:rPr>
-            <w:rStyle w:val="Hyperlink"/>
-          </w:rPr>
-          <w:t xml:space="preserve">Training large language models on narrow tasks can lead to broad misalignment</w:t>
+        <w:t xml:space="preserve">OpenAI.</w:t>
+      </w:r>
+      <w:r>
+        <w:t xml:space="preserve"> </w:t>
+      </w:r>
+      <w:hyperlink r:id="rId62">
+        <w:r>
+          <w:rPr>
+            <w:rStyle w:val="Hyperlink"/>
+          </w:rPr>
+          <w:t xml:space="preserve">ChatGPT</w:t>
+        </w:r>
+        <w:r>
+          <w:rPr>
+            <w:rStyle w:val="Hyperlink"/>
+          </w:rPr>
+          <w:t xml:space="preserve"> </w:t>
+        </w:r>
+        <w:r>
+          <w:rPr>
+            <w:rStyle w:val="Hyperlink"/>
+          </w:rPr>
+          <w:t xml:space="preserve">weekly active users</w:t>
+        </w:r>
+      </w:hyperlink>
+      <w:r>
+        <w:t xml:space="preserve">. (2026).</w:t>
+      </w:r>
+    </w:p>
+    <w:bookmarkEnd w:id="63"/>
+    <w:bookmarkStart w:id="65" w:name="ref-kirk2025socioaffective"/>
+    <w:p>
+      <w:pPr>
+        <w:pStyle w:val="Bibliography"/>
+      </w:pPr>
+      <w:r>
+        <w:t xml:space="preserve">2.</w:t>
+      </w:r>
+      <w:r>
+        <w:t xml:space="preserve"> </w:t>
+      </w:r>
+      <w:r>
+        <w:t xml:space="preserve">	</w:t>
+      </w:r>
+      <w:r>
+        <w:t xml:space="preserve">Kirk, H. R., Gabriel, I., Summerfield, C., Vidgen, B. &amp; Hale, S. A.</w:t>
+      </w:r>
+      <w:r>
+        <w:t xml:space="preserve"> </w:t>
+      </w:r>
+      <w:hyperlink r:id="rId64">
+        <w:r>
+          <w:rPr>
+            <w:rStyle w:val="Hyperlink"/>
+          </w:rPr>
+          <w:t xml:space="preserve">Why human-</w:t>
+        </w:r>
+        <w:r>
+          <w:rPr>
+            <w:rStyle w:val="Hyperlink"/>
+          </w:rPr>
+          <w:t xml:space="preserve">AI</w:t>
+        </w:r>
+        <w:r>
+          <w:rPr>
+            <w:rStyle w:val="Hyperlink"/>
+          </w:rPr>
+          <w:t xml:space="preserve"> </w:t>
+        </w:r>
+        <w:r>
+          <w:rPr>
+            <w:rStyle w:val="Hyperlink"/>
+          </w:rPr>
+          <w:t xml:space="preserve">relationships need socioaffective alignment</w:t>
         </w:r>
       </w:hyperlink>
       <w:r>
@@ -3841,7 +3915,7 @@
           <w:i/>
           <w:iCs/>
         </w:rPr>
-        <w:t xml:space="preserve">Nature</w:t>
+        <w:t xml:space="preserve">Humanities and Social Sciences Communications</w:t>
       </w:r>
       <w:r>
         <w:t xml:space="preserve"> </w:t>
@@ -3851,20 +3925,20 @@
           <w:b/>
           <w:bCs/>
         </w:rPr>
-        <w:t xml:space="preserve">649</w:t>
-      </w:r>
-      <w:r>
-        <w:t xml:space="preserve">, 584–589 (2026).</w:t>
-      </w:r>
-    </w:p>
-    <w:bookmarkEnd w:id="61"/>
-    <w:bookmarkStart w:id="63" w:name="ref-ibrahim2026warm"/>
+        <w:t xml:space="preserve">12</w:t>
+      </w:r>
+      <w:r>
+        <w:t xml:space="preserve">, 1–9 (2025).</w:t>
+      </w:r>
+    </w:p>
+    <w:bookmarkEnd w:id="65"/>
+    <w:bookmarkStart w:id="67" w:name="ref-rubin2025empathy"/>
     <w:p>
       <w:pPr>
         <w:pStyle w:val="Bibliography"/>
       </w:pPr>
       <w:r>
-        <w:t xml:space="preserve">2.</w:t>
+        <w:t xml:space="preserve">3.</w:t>
       </w:r>
       <w:r>
         <w:t xml:space="preserve"> </w:t>
@@ -3873,17 +3947,45 @@
         <w:t xml:space="preserve">	</w:t>
       </w:r>
       <w:r>
-        <w:t xml:space="preserve">Ibrahim, L., Hafner, F. S. &amp; Rocher, L.</w:t>
-      </w:r>
-      <w:r>
-        <w:t xml:space="preserve"> </w:t>
-      </w:r>
-      <w:hyperlink r:id="rId62">
-        <w:r>
-          <w:rPr>
-            <w:rStyle w:val="Hyperlink"/>
-          </w:rPr>
-          <w:t xml:space="preserve">Training language models to be warm can reduce accuracy and increase sycophancy</w:t>
+        <w:t xml:space="preserve">Rubin, M.</w:t>
+      </w:r>
+      <w:r>
+        <w:t xml:space="preserve"> </w:t>
+      </w:r>
+      <w:r>
+        <w:rPr>
+          <w:i/>
+          <w:iCs/>
+        </w:rPr>
+        <w:t xml:space="preserve">et al.</w:t>
+      </w:r>
+      <w:r>
+        <w:t xml:space="preserve"> </w:t>
+      </w:r>
+      <w:hyperlink r:id="rId66">
+        <w:r>
+          <w:rPr>
+            <w:rStyle w:val="Hyperlink"/>
+          </w:rPr>
+          <w:t xml:space="preserve">Comparing the value of perceived human versus</w:t>
+        </w:r>
+        <w:r>
+          <w:rPr>
+            <w:rStyle w:val="Hyperlink"/>
+          </w:rPr>
+          <w:t xml:space="preserve"> </w:t>
+        </w:r>
+        <w:r>
+          <w:rPr>
+            <w:rStyle w:val="Hyperlink"/>
+          </w:rPr>
+          <w:t xml:space="preserve">AI</w:t>
+        </w:r>
+        <w:r>
+          <w:rPr>
+            <w:rStyle w:val="Hyperlink"/>
+          </w:rPr>
+          <w:t xml:space="preserve">-generated empathy</w:t>
         </w:r>
       </w:hyperlink>
       <w:r>
@@ -3897,7 +3999,7 @@
           <w:i/>
           <w:iCs/>
         </w:rPr>
-        <w:t xml:space="preserve">Nature</w:t>
+        <w:t xml:space="preserve">Nature Human Behaviour</w:t>
       </w:r>
       <w:r>
         <w:t xml:space="preserve"> </w:t>
@@ -3907,20 +4009,20 @@
           <w:b/>
           <w:bCs/>
         </w:rPr>
-        <w:t xml:space="preserve">652</w:t>
-      </w:r>
-      <w:r>
-        <w:t xml:space="preserve">, 1159–1165 (2026).</w:t>
-      </w:r>
-    </w:p>
-    <w:bookmarkEnd w:id="63"/>
-    <w:bookmarkStart w:id="65" w:name="ref-cloud2026subliminal"/>
+        <w:t xml:space="preserve">9</w:t>
+      </w:r>
+      <w:r>
+        <w:t xml:space="preserve">, 2345–2359 (2025).</w:t>
+      </w:r>
+    </w:p>
+    <w:bookmarkEnd w:id="67"/>
+    <w:bookmarkStart w:id="69" w:name="ref-mitchell2025lie"/>
     <w:p>
       <w:pPr>
         <w:pStyle w:val="Bibliography"/>
       </w:pPr>
       <w:r>
-        <w:t xml:space="preserve">3.</w:t>
+        <w:t xml:space="preserve">4.</w:t>
       </w:r>
       <w:r>
         <w:t xml:space="preserve"> </w:t>
@@ -3929,27 +4031,41 @@
         <w:t xml:space="preserve">	</w:t>
       </w:r>
       <w:r>
-        <w:t xml:space="preserve">Cloud, A.</w:t>
-      </w:r>
-      <w:r>
-        <w:t xml:space="preserve"> </w:t>
-      </w:r>
-      <w:r>
-        <w:rPr>
-          <w:i/>
-          <w:iCs/>
-        </w:rPr>
-        <w:t xml:space="preserve">et al.</w:t>
-      </w:r>
-      <w:r>
-        <w:t xml:space="preserve"> </w:t>
-      </w:r>
-      <w:hyperlink r:id="rId64">
-        <w:r>
-          <w:rPr>
-            <w:rStyle w:val="Hyperlink"/>
-          </w:rPr>
-          <w:t xml:space="preserve">Subliminal learning: Language models transmit behavioural traits via hidden signals in data</w:t>
+        <w:t xml:space="preserve">Mitchell, M.</w:t>
+      </w:r>
+      <w:r>
+        <w:t xml:space="preserve"> </w:t>
+      </w:r>
+      <w:hyperlink r:id="rId68">
+        <w:r>
+          <w:rPr>
+            <w:rStyle w:val="Hyperlink"/>
+          </w:rPr>
+          <w:t xml:space="preserve">Why</w:t>
+        </w:r>
+        <w:r>
+          <w:rPr>
+            <w:rStyle w:val="Hyperlink"/>
+          </w:rPr>
+          <w:t xml:space="preserve"> </w:t>
+        </w:r>
+        <w:r>
+          <w:rPr>
+            <w:rStyle w:val="Hyperlink"/>
+          </w:rPr>
+          <w:t xml:space="preserve">AI</w:t>
+        </w:r>
+        <w:r>
+          <w:rPr>
+            <w:rStyle w:val="Hyperlink"/>
+          </w:rPr>
+          <w:t xml:space="preserve"> </w:t>
+        </w:r>
+        <w:r>
+          <w:rPr>
+            <w:rStyle w:val="Hyperlink"/>
+          </w:rPr>
+          <w:t xml:space="preserve">chatbots lie to us</w:t>
         </w:r>
       </w:hyperlink>
       <w:r>
@@ -3963,7 +4079,7 @@
           <w:i/>
           <w:iCs/>
         </w:rPr>
-        <w:t xml:space="preserve">Nature</w:t>
+        <w:t xml:space="preserve">Science</w:t>
       </w:r>
       <w:r>
         <w:t xml:space="preserve"> </w:t>
@@ -3973,20 +4089,20 @@
           <w:b/>
           <w:bCs/>
         </w:rPr>
-        <w:t xml:space="preserve">652</w:t>
-      </w:r>
-      <w:r>
-        <w:t xml:space="preserve">, 615–621 (2026).</w:t>
-      </w:r>
-    </w:p>
-    <w:bookmarkEnd w:id="65"/>
-    <w:bookmarkStart w:id="67" w:name="ref-openai2026scaling"/>
+        <w:t xml:space="preserve">389</w:t>
+      </w:r>
+      <w:r>
+        <w:t xml:space="preserve">, (2025).</w:t>
+      </w:r>
+    </w:p>
+    <w:bookmarkEnd w:id="69"/>
+    <w:bookmarkStart w:id="71" w:name="ref-hauser2025evaluating"/>
     <w:p>
       <w:pPr>
         <w:pStyle w:val="Bibliography"/>
       </w:pPr>
       <w:r>
-        <w:t xml:space="preserve">4.</w:t>
+        <w:t xml:space="preserve">5.</w:t>
       </w:r>
       <w:r>
         <w:t xml:space="preserve"> </w:t>
@@ -3995,17 +4111,17 @@
         <w:t xml:space="preserve">	</w:t>
       </w:r>
       <w:r>
-        <w:t xml:space="preserve">OpenAI.</w:t>
-      </w:r>
-      <w:r>
-        <w:t xml:space="preserve"> </w:t>
-      </w:r>
-      <w:hyperlink r:id="rId66">
-        <w:r>
-          <w:rPr>
-            <w:rStyle w:val="Hyperlink"/>
-          </w:rPr>
-          <w:t xml:space="preserve">ChatGPT</w:t>
+        <w:t xml:space="preserve">Hauser, O. P., Light, M., Shelmerdine, L. &amp; Blumenau, J.</w:t>
+      </w:r>
+      <w:r>
+        <w:t xml:space="preserve"> </w:t>
+      </w:r>
+      <w:hyperlink r:id="rId70">
+        <w:r>
+          <w:rPr>
+            <w:rStyle w:val="Hyperlink"/>
+          </w:rPr>
+          <w:t xml:space="preserve">Why evaluating the impact of</w:t>
         </w:r>
         <w:r>
           <w:rPr>
@@ -4017,45 +4133,6 @@
           <w:rPr>
             <w:rStyle w:val="Hyperlink"/>
           </w:rPr>
-          <w:t xml:space="preserve">weekly active users</w:t>
-        </w:r>
-      </w:hyperlink>
-      <w:r>
-        <w:t xml:space="preserve">. (2026).</w:t>
-      </w:r>
-    </w:p>
-    <w:bookmarkEnd w:id="67"/>
-    <w:bookmarkStart w:id="69" w:name="ref-kirk2025socioaffective"/>
-    <w:p>
-      <w:pPr>
-        <w:pStyle w:val="Bibliography"/>
-      </w:pPr>
-      <w:r>
-        <w:t xml:space="preserve">5.</w:t>
-      </w:r>
-      <w:r>
-        <w:t xml:space="preserve"> </w:t>
-      </w:r>
-      <w:r>
-        <w:t xml:space="preserve">	</w:t>
-      </w:r>
-      <w:r>
-        <w:t xml:space="preserve">Kirk, H. R., Gabriel, I., Summerfield, C., Vidgen, B. &amp; Hale, S. A.</w:t>
-      </w:r>
-      <w:r>
-        <w:t xml:space="preserve"> </w:t>
-      </w:r>
-      <w:hyperlink r:id="rId68">
-        <w:r>
-          <w:rPr>
-            <w:rStyle w:val="Hyperlink"/>
-          </w:rPr>
-          <w:t xml:space="preserve">Why human-</w:t>
-        </w:r>
-        <w:r>
-          <w:rPr>
-            <w:rStyle w:val="Hyperlink"/>
-          </w:rPr>
           <w:t xml:space="preserve">AI</w:t>
         </w:r>
         <w:r>
@@ -4068,7 +4145,7 @@
           <w:rPr>
             <w:rStyle w:val="Hyperlink"/>
           </w:rPr>
-          <w:t xml:space="preserve">relationships need socioaffective alignment</w:t>
+          <w:t xml:space="preserve">needs to start now</w:t>
         </w:r>
       </w:hyperlink>
       <w:r>
@@ -4082,7 +4159,7 @@
           <w:i/>
           <w:iCs/>
         </w:rPr>
-        <w:t xml:space="preserve">Humanities and Social Sciences Communications</w:t>
+        <w:t xml:space="preserve">Nature</w:t>
       </w:r>
       <w:r>
         <w:t xml:space="preserve"> </w:t>
@@ -4092,14 +4169,14 @@
           <w:b/>
           <w:bCs/>
         </w:rPr>
-        <w:t xml:space="preserve">12</w:t>
-      </w:r>
-      <w:r>
-        <w:t xml:space="preserve">, 1–9 (2025).</w:t>
-      </w:r>
-    </w:p>
-    <w:bookmarkEnd w:id="69"/>
-    <w:bookmarkStart w:id="71" w:name="ref-rubin2025empathy"/>
+        <w:t xml:space="preserve">643</w:t>
+      </w:r>
+      <w:r>
+        <w:t xml:space="preserve">, 910–912 (2025).</w:t>
+      </w:r>
+    </w:p>
+    <w:bookmarkEnd w:id="71"/>
+    <w:bookmarkStart w:id="73" w:name="ref-betley2026emergent"/>
     <w:p>
       <w:pPr>
         <w:pStyle w:val="Bibliography"/>
@@ -4114,7 +4191,7 @@
         <w:t xml:space="preserve">	</w:t>
       </w:r>
       <w:r>
-        <w:t xml:space="preserve">Rubin, M.</w:t>
+        <w:t xml:space="preserve">Betley, J.</w:t>
       </w:r>
       <w:r>
         <w:t xml:space="preserve"> </w:t>
@@ -4129,30 +4206,12 @@
       <w:r>
         <w:t xml:space="preserve"> </w:t>
       </w:r>
-      <w:hyperlink r:id="rId70">
-        <w:r>
-          <w:rPr>
-            <w:rStyle w:val="Hyperlink"/>
-          </w:rPr>
-          <w:t xml:space="preserve">Comparing the value of perceived human versus</w:t>
-        </w:r>
-        <w:r>
-          <w:rPr>
-            <w:rStyle w:val="Hyperlink"/>
-          </w:rPr>
-          <w:t xml:space="preserve"> </w:t>
-        </w:r>
-        <w:r>
-          <w:rPr>
-            <w:rStyle w:val="Hyperlink"/>
-          </w:rPr>
-          <w:t xml:space="preserve">AI</w:t>
-        </w:r>
-        <w:r>
-          <w:rPr>
-            <w:rStyle w:val="Hyperlink"/>
-          </w:rPr>
-          <w:t xml:space="preserve">-generated empathy</w:t>
+      <w:hyperlink r:id="rId72">
+        <w:r>
+          <w:rPr>
+            <w:rStyle w:val="Hyperlink"/>
+          </w:rPr>
+          <w:t xml:space="preserve">Training large language models on narrow tasks can lead to broad misalignment</w:t>
         </w:r>
       </w:hyperlink>
       <w:r>
@@ -4166,7 +4225,7 @@
           <w:i/>
           <w:iCs/>
         </w:rPr>
-        <w:t xml:space="preserve">Nature Human Behaviour</w:t>
+        <w:t xml:space="preserve">Nature</w:t>
       </w:r>
       <w:r>
         <w:t xml:space="preserve"> </w:t>
@@ -4176,14 +4235,14 @@
           <w:b/>
           <w:bCs/>
         </w:rPr>
-        <w:t xml:space="preserve">9</w:t>
-      </w:r>
-      <w:r>
-        <w:t xml:space="preserve">, 2345–2359 (2025).</w:t>
-      </w:r>
-    </w:p>
-    <w:bookmarkEnd w:id="71"/>
-    <w:bookmarkStart w:id="73" w:name="ref-mitchell2025lie"/>
+        <w:t xml:space="preserve">649</w:t>
+      </w:r>
+      <w:r>
+        <w:t xml:space="preserve">, 584–589 (2026).</w:t>
+      </w:r>
+    </w:p>
+    <w:bookmarkEnd w:id="73"/>
+    <w:bookmarkStart w:id="75" w:name="ref-sharma2024sycophancy"/>
     <w:p>
       <w:pPr>
         <w:pStyle w:val="Bibliography"/>
@@ -4198,41 +4257,145 @@
         <w:t xml:space="preserve">	</w:t>
       </w:r>
       <w:r>
-        <w:t xml:space="preserve">Mitchell, M.</w:t>
-      </w:r>
-      <w:r>
-        <w:t xml:space="preserve"> </w:t>
-      </w:r>
-      <w:hyperlink r:id="rId72">
-        <w:r>
-          <w:rPr>
-            <w:rStyle w:val="Hyperlink"/>
-          </w:rPr>
-          <w:t xml:space="preserve">Why</w:t>
-        </w:r>
-        <w:r>
-          <w:rPr>
-            <w:rStyle w:val="Hyperlink"/>
-          </w:rPr>
-          <w:t xml:space="preserve"> </w:t>
-        </w:r>
-        <w:r>
-          <w:rPr>
-            <w:rStyle w:val="Hyperlink"/>
-          </w:rPr>
-          <w:t xml:space="preserve">AI</w:t>
-        </w:r>
-        <w:r>
-          <w:rPr>
-            <w:rStyle w:val="Hyperlink"/>
-          </w:rPr>
-          <w:t xml:space="preserve"> </w:t>
-        </w:r>
-        <w:r>
-          <w:rPr>
-            <w:rStyle w:val="Hyperlink"/>
-          </w:rPr>
-          <w:t xml:space="preserve">chatbots lie to us</w:t>
+        <w:t xml:space="preserve">Sharma, M.</w:t>
+      </w:r>
+      <w:r>
+        <w:t xml:space="preserve"> </w:t>
+      </w:r>
+      <w:r>
+        <w:rPr>
+          <w:i/>
+          <w:iCs/>
+        </w:rPr>
+        <w:t xml:space="preserve">et al.</w:t>
+      </w:r>
+      <w:r>
+        <w:t xml:space="preserve"> Towards understanding sycophancy in language models.</w:t>
+      </w:r>
+      <w:r>
+        <w:t xml:space="preserve"> </w:t>
+      </w:r>
+      <w:r>
+        <w:rPr>
+          <w:i/>
+          <w:iCs/>
+        </w:rPr>
+        <w:t xml:space="preserve">ICLR</w:t>
+      </w:r>
+      <w:r>
+        <w:t xml:space="preserve"> </w:t>
+      </w:r>
+      <w:hyperlink r:id="rId74">
+        <w:r>
+          <w:rPr>
+            <w:rStyle w:val="Hyperlink"/>
+          </w:rPr>
+          <w:t xml:space="preserve">https://arxiv.org/abs/2310.13548</w:t>
+        </w:r>
+      </w:hyperlink>
+      <w:r>
+        <w:t xml:space="preserve"> </w:t>
+      </w:r>
+      <w:r>
+        <w:t xml:space="preserve">(2024).</w:t>
+      </w:r>
+    </w:p>
+    <w:bookmarkEnd w:id="75"/>
+    <w:bookmarkStart w:id="77" w:name="ref-meinke2025scheming"/>
+    <w:p>
+      <w:pPr>
+        <w:pStyle w:val="Bibliography"/>
+      </w:pPr>
+      <w:r>
+        <w:t xml:space="preserve">8.</w:t>
+      </w:r>
+      <w:r>
+        <w:t xml:space="preserve"> </w:t>
+      </w:r>
+      <w:r>
+        <w:t xml:space="preserve">	</w:t>
+      </w:r>
+      <w:r>
+        <w:t xml:space="preserve">Meinke, A.</w:t>
+      </w:r>
+      <w:r>
+        <w:t xml:space="preserve"> </w:t>
+      </w:r>
+      <w:r>
+        <w:rPr>
+          <w:i/>
+          <w:iCs/>
+        </w:rPr>
+        <w:t xml:space="preserve">et al.</w:t>
+      </w:r>
+      <w:r>
+        <w:t xml:space="preserve"> Frontier models are capable of in-context scheming.</w:t>
+      </w:r>
+      <w:r>
+        <w:t xml:space="preserve"> </w:t>
+      </w:r>
+      <w:r>
+        <w:rPr>
+          <w:i/>
+          <w:iCs/>
+        </w:rPr>
+        <w:t xml:space="preserve">arXiv preprint</w:t>
+      </w:r>
+      <w:r>
+        <w:t xml:space="preserve"> </w:t>
+      </w:r>
+      <w:hyperlink r:id="rId76">
+        <w:r>
+          <w:rPr>
+            <w:rStyle w:val="Hyperlink"/>
+          </w:rPr>
+          <w:t xml:space="preserve">https://arxiv.org/abs/2412.04984</w:t>
+        </w:r>
+      </w:hyperlink>
+      <w:r>
+        <w:t xml:space="preserve"> </w:t>
+      </w:r>
+      <w:r>
+        <w:t xml:space="preserve">(2025).</w:t>
+      </w:r>
+    </w:p>
+    <w:bookmarkEnd w:id="77"/>
+    <w:bookmarkStart w:id="79" w:name="ref-cloud2026subliminal"/>
+    <w:p>
+      <w:pPr>
+        <w:pStyle w:val="Bibliography"/>
+      </w:pPr>
+      <w:r>
+        <w:t xml:space="preserve">9.</w:t>
+      </w:r>
+      <w:r>
+        <w:t xml:space="preserve"> </w:t>
+      </w:r>
+      <w:r>
+        <w:t xml:space="preserve">	</w:t>
+      </w:r>
+      <w:r>
+        <w:t xml:space="preserve">Cloud, A.</w:t>
+      </w:r>
+      <w:r>
+        <w:t xml:space="preserve"> </w:t>
+      </w:r>
+      <w:r>
+        <w:rPr>
+          <w:i/>
+          <w:iCs/>
+        </w:rPr>
+        <w:t xml:space="preserve">et al.</w:t>
+      </w:r>
+      <w:r>
+        <w:t xml:space="preserve"> </w:t>
+      </w:r>
+      <w:hyperlink r:id="rId78">
+        <w:r>
+          <w:rPr>
+            <w:rStyle w:val="Hyperlink"/>
+          </w:rPr>
+          <w:t xml:space="preserve">Language models transmit behavioural traits through hidden signals in data</w:t>
         </w:r>
       </w:hyperlink>
       <w:r>
@@ -4246,7 +4409,7 @@
           <w:i/>
           <w:iCs/>
         </w:rPr>
-        <w:t xml:space="preserve">Science</w:t>
+        <w:t xml:space="preserve">Nature</w:t>
       </w:r>
       <w:r>
         <w:t xml:space="preserve"> </w:t>
@@ -4256,20 +4419,20 @@
           <w:b/>
           <w:bCs/>
         </w:rPr>
-        <w:t xml:space="preserve">389</w:t>
-      </w:r>
-      <w:r>
-        <w:t xml:space="preserve">, (2025).</w:t>
-      </w:r>
-    </w:p>
-    <w:bookmarkEnd w:id="73"/>
-    <w:bookmarkStart w:id="75" w:name="ref-hauser2025evaluating"/>
+        <w:t xml:space="preserve">652</w:t>
+      </w:r>
+      <w:r>
+        <w:t xml:space="preserve">, 615–621 (2026).</w:t>
+      </w:r>
+    </w:p>
+    <w:bookmarkEnd w:id="79"/>
+    <w:bookmarkStart w:id="81" w:name="ref-ibrahim2026warm"/>
     <w:p>
       <w:pPr>
         <w:pStyle w:val="Bibliography"/>
       </w:pPr>
       <w:r>
-        <w:t xml:space="preserve">8.</w:t>
+        <w:t xml:space="preserve">10.</w:t>
       </w:r>
       <w:r>
         <w:t xml:space="preserve"> </w:t>
@@ -4278,41 +4441,17 @@
         <w:t xml:space="preserve">	</w:t>
       </w:r>
       <w:r>
-        <w:t xml:space="preserve">Hauser, O. P., Light, M., Shelmerdine, L. &amp; Blumenau, J.</w:t>
-      </w:r>
-      <w:r>
-        <w:t xml:space="preserve"> </w:t>
-      </w:r>
-      <w:hyperlink r:id="rId74">
-        <w:r>
-          <w:rPr>
-            <w:rStyle w:val="Hyperlink"/>
-          </w:rPr>
-          <w:t xml:space="preserve">Why evaluating the impact of</w:t>
-        </w:r>
-        <w:r>
-          <w:rPr>
-            <w:rStyle w:val="Hyperlink"/>
-          </w:rPr>
-          <w:t xml:space="preserve"> </w:t>
-        </w:r>
-        <w:r>
-          <w:rPr>
-            <w:rStyle w:val="Hyperlink"/>
-          </w:rPr>
-          <w:t xml:space="preserve">AI</w:t>
-        </w:r>
-        <w:r>
-          <w:rPr>
-            <w:rStyle w:val="Hyperlink"/>
-          </w:rPr>
-          <w:t xml:space="preserve"> </w:t>
-        </w:r>
-        <w:r>
-          <w:rPr>
-            <w:rStyle w:val="Hyperlink"/>
-          </w:rPr>
-          <w:t xml:space="preserve">needs to start now</w:t>
+        <w:t xml:space="preserve">Ibrahim, L., Hafner, F. S. &amp; Rocher, L.</w:t>
+      </w:r>
+      <w:r>
+        <w:t xml:space="preserve"> </w:t>
+      </w:r>
+      <w:hyperlink r:id="rId80">
+        <w:r>
+          <w:rPr>
+            <w:rStyle w:val="Hyperlink"/>
+          </w:rPr>
+          <w:t xml:space="preserve">Training language models to be warm can reduce accuracy and increase sycophancy</w:t>
         </w:r>
       </w:hyperlink>
       <w:r>
@@ -4336,20 +4475,20 @@
           <w:b/>
           <w:bCs/>
         </w:rPr>
-        <w:t xml:space="preserve">643</w:t>
-      </w:r>
-      <w:r>
-        <w:t xml:space="preserve">, 910–912 (2025).</w:t>
-      </w:r>
-    </w:p>
-    <w:bookmarkEnd w:id="75"/>
-    <w:bookmarkStart w:id="77" w:name="ref-sharma2024sycophancy"/>
+        <w:t xml:space="preserve">652</w:t>
+      </w:r>
+      <w:r>
+        <w:t xml:space="preserve">, 1159–1165 (2026).</w:t>
+      </w:r>
+    </w:p>
+    <w:bookmarkEnd w:id="81"/>
+    <w:bookmarkStart w:id="83" w:name="ref-afonin2025incontext"/>
     <w:p>
       <w:pPr>
         <w:pStyle w:val="Bibliography"/>
       </w:pPr>
       <w:r>
-        <w:t xml:space="preserve">9.</w:t>
+        <w:t xml:space="preserve">11.</w:t>
       </w:r>
       <w:r>
         <w:t xml:space="preserve"> </w:t>
@@ -4358,7 +4497,7 @@
         <w:t xml:space="preserve">	</w:t>
       </w:r>
       <w:r>
-        <w:t xml:space="preserve">Sharma, M.</w:t>
+        <w:t xml:space="preserve">Afonin, N.</w:t>
       </w:r>
       <w:r>
         <w:t xml:space="preserve"> </w:t>
@@ -4371,27 +4510,86 @@
         <w:t xml:space="preserve">et al.</w:t>
       </w:r>
       <w:r>
-        <w:t xml:space="preserve"> Towards understanding sycophancy in language models.</w:t>
-      </w:r>
-      <w:r>
-        <w:t xml:space="preserve"> </w:t>
-      </w:r>
-      <w:r>
-        <w:rPr>
-          <w:i/>
-          <w:iCs/>
-        </w:rPr>
-        <w:t xml:space="preserve">ICLR</w:t>
-      </w:r>
-      <w:r>
-        <w:t xml:space="preserve"> </w:t>
-      </w:r>
-      <w:hyperlink r:id="rId76">
-        <w:r>
-          <w:rPr>
-            <w:rStyle w:val="Hyperlink"/>
-          </w:rPr>
-          <w:t xml:space="preserve">https://arxiv.org/abs/2310.13548</w:t>
+        <w:t xml:space="preserve"> Emergent misalignment via in-context learning: Narrow in-context examples can produce broadly misaligned LLMs.</w:t>
+      </w:r>
+      <w:r>
+        <w:t xml:space="preserve"> </w:t>
+      </w:r>
+      <w:r>
+        <w:rPr>
+          <w:i/>
+          <w:iCs/>
+        </w:rPr>
+        <w:t xml:space="preserve">arXiv preprint</w:t>
+      </w:r>
+      <w:r>
+        <w:t xml:space="preserve"> </w:t>
+      </w:r>
+      <w:hyperlink r:id="rId82">
+        <w:r>
+          <w:rPr>
+            <w:rStyle w:val="Hyperlink"/>
+          </w:rPr>
+          <w:t xml:space="preserve">https://arxiv.org/abs/2510.11288</w:t>
+        </w:r>
+      </w:hyperlink>
+      <w:r>
+        <w:t xml:space="preserve"> </w:t>
+      </w:r>
+      <w:r>
+        <w:t xml:space="preserve">(2025).</w:t>
+      </w:r>
+    </w:p>
+    <w:bookmarkEnd w:id="83"/>
+    <w:bookmarkStart w:id="85" w:name="ref-anwar2024foundational"/>
+    <w:p>
+      <w:pPr>
+        <w:pStyle w:val="Bibliography"/>
+      </w:pPr>
+      <w:r>
+        <w:t xml:space="preserve">12.</w:t>
+      </w:r>
+      <w:r>
+        <w:t xml:space="preserve"> </w:t>
+      </w:r>
+      <w:r>
+        <w:t xml:space="preserve">	</w:t>
+      </w:r>
+      <w:r>
+        <w:t xml:space="preserve">Anwar, U.</w:t>
+      </w:r>
+      <w:r>
+        <w:t xml:space="preserve"> </w:t>
+      </w:r>
+      <w:r>
+        <w:rPr>
+          <w:i/>
+          <w:iCs/>
+        </w:rPr>
+        <w:t xml:space="preserve">et al.</w:t>
+      </w:r>
+      <w:r>
+        <w:t xml:space="preserve"> Foundational challenges in assuring alignment and safety of large language models.</w:t>
+      </w:r>
+      <w:r>
+        <w:t xml:space="preserve"> </w:t>
+      </w:r>
+      <w:r>
+        <w:rPr>
+          <w:i/>
+          <w:iCs/>
+        </w:rPr>
+        <w:t xml:space="preserve">Transactions on Machine Learning Research</w:t>
+      </w:r>
+      <w:r>
+        <w:t xml:space="preserve"> </w:t>
+      </w:r>
+      <w:hyperlink r:id="rId84">
+        <w:r>
+          <w:rPr>
+            <w:rStyle w:val="Hyperlink"/>
+          </w:rPr>
+          <w:t xml:space="preserve">https://arxiv.org/abs/2404.09932</w:t>
         </w:r>
       </w:hyperlink>
       <w:r>
@@ -4401,14 +4599,14 @@
         <w:t xml:space="preserve">(2024).</w:t>
       </w:r>
     </w:p>
-    <w:bookmarkEnd w:id="77"/>
-    <w:bookmarkStart w:id="79" w:name="ref-meinke2025scheming"/>
+    <w:bookmarkEnd w:id="85"/>
+    <w:bookmarkStart w:id="87" w:name="ref-hofmann2024dialect"/>
     <w:p>
       <w:pPr>
         <w:pStyle w:val="Bibliography"/>
       </w:pPr>
       <w:r>
-        <w:t xml:space="preserve">10.</w:t>
+        <w:t xml:space="preserve">13.</w:t>
       </w:r>
       <w:r>
         <w:t xml:space="preserve"> </w:t>
@@ -4417,189 +4615,12 @@
         <w:t xml:space="preserve">	</w:t>
       </w:r>
       <w:r>
-        <w:t xml:space="preserve">Meinke, A.</w:t>
-      </w:r>
-      <w:r>
-        <w:t xml:space="preserve"> </w:t>
-      </w:r>
-      <w:r>
-        <w:rPr>
-          <w:i/>
-          <w:iCs/>
-        </w:rPr>
-        <w:t xml:space="preserve">et al.</w:t>
-      </w:r>
-      <w:r>
-        <w:t xml:space="preserve"> Frontier models are capable of in-context scheming.</w:t>
-      </w:r>
-      <w:r>
-        <w:t xml:space="preserve"> </w:t>
-      </w:r>
-      <w:r>
-        <w:rPr>
-          <w:i/>
-          <w:iCs/>
-        </w:rPr>
-        <w:t xml:space="preserve">arXiv preprint</w:t>
-      </w:r>
-      <w:r>
-        <w:t xml:space="preserve"> </w:t>
-      </w:r>
-      <w:hyperlink r:id="rId78">
-        <w:r>
-          <w:rPr>
-            <w:rStyle w:val="Hyperlink"/>
-          </w:rPr>
-          <w:t xml:space="preserve">https://arxiv.org/abs/2412.04984</w:t>
-        </w:r>
-      </w:hyperlink>
-      <w:r>
-        <w:t xml:space="preserve"> </w:t>
-      </w:r>
-      <w:r>
-        <w:t xml:space="preserve">(2025).</w:t>
-      </w:r>
-    </w:p>
-    <w:bookmarkEnd w:id="79"/>
-    <w:bookmarkStart w:id="81" w:name="ref-afonin2025incontext"/>
-    <w:p>
-      <w:pPr>
-        <w:pStyle w:val="Bibliography"/>
-      </w:pPr>
-      <w:r>
-        <w:t xml:space="preserve">11.</w:t>
-      </w:r>
-      <w:r>
-        <w:t xml:space="preserve"> </w:t>
-      </w:r>
-      <w:r>
-        <w:t xml:space="preserve">	</w:t>
-      </w:r>
-      <w:r>
-        <w:t xml:space="preserve">Afonin, N.</w:t>
-      </w:r>
-      <w:r>
-        <w:t xml:space="preserve"> </w:t>
-      </w:r>
-      <w:r>
-        <w:rPr>
-          <w:i/>
-          <w:iCs/>
-        </w:rPr>
-        <w:t xml:space="preserve">et al.</w:t>
-      </w:r>
-      <w:r>
-        <w:t xml:space="preserve"> Emergent misalignment via in-context learning: Narrow in-context examples can produce broadly misaligned LLMs.</w:t>
-      </w:r>
-      <w:r>
-        <w:t xml:space="preserve"> </w:t>
-      </w:r>
-      <w:r>
-        <w:rPr>
-          <w:i/>
-          <w:iCs/>
-        </w:rPr>
-        <w:t xml:space="preserve">arXiv preprint</w:t>
-      </w:r>
-      <w:r>
-        <w:t xml:space="preserve"> </w:t>
-      </w:r>
-      <w:hyperlink r:id="rId80">
-        <w:r>
-          <w:rPr>
-            <w:rStyle w:val="Hyperlink"/>
-          </w:rPr>
-          <w:t xml:space="preserve">https://arxiv.org/abs/2510.11288</w:t>
-        </w:r>
-      </w:hyperlink>
-      <w:r>
-        <w:t xml:space="preserve"> </w:t>
-      </w:r>
-      <w:r>
-        <w:t xml:space="preserve">(2025).</w:t>
-      </w:r>
-    </w:p>
-    <w:bookmarkEnd w:id="81"/>
-    <w:bookmarkStart w:id="83" w:name="ref-anwar2024foundational"/>
-    <w:p>
-      <w:pPr>
-        <w:pStyle w:val="Bibliography"/>
-      </w:pPr>
-      <w:r>
-        <w:t xml:space="preserve">12.</w:t>
-      </w:r>
-      <w:r>
-        <w:t xml:space="preserve"> </w:t>
-      </w:r>
-      <w:r>
-        <w:t xml:space="preserve">	</w:t>
-      </w:r>
-      <w:r>
-        <w:t xml:space="preserve">Anwar, U.</w:t>
-      </w:r>
-      <w:r>
-        <w:t xml:space="preserve"> </w:t>
-      </w:r>
-      <w:r>
-        <w:rPr>
-          <w:i/>
-          <w:iCs/>
-        </w:rPr>
-        <w:t xml:space="preserve">et al.</w:t>
-      </w:r>
-      <w:r>
-        <w:t xml:space="preserve"> Foundational challenges in assuring alignment and safety of large language models.</w:t>
-      </w:r>
-      <w:r>
-        <w:t xml:space="preserve"> </w:t>
-      </w:r>
-      <w:r>
-        <w:rPr>
-          <w:i/>
-          <w:iCs/>
-        </w:rPr>
-        <w:t xml:space="preserve">Transactions on Machine Learning Research</w:t>
-      </w:r>
-      <w:r>
-        <w:t xml:space="preserve"> </w:t>
-      </w:r>
-      <w:hyperlink r:id="rId82">
-        <w:r>
-          <w:rPr>
-            <w:rStyle w:val="Hyperlink"/>
-          </w:rPr>
-          <w:t xml:space="preserve">https://arxiv.org/abs/2404.09932</w:t>
-        </w:r>
-      </w:hyperlink>
-      <w:r>
-        <w:t xml:space="preserve"> </w:t>
-      </w:r>
-      <w:r>
-        <w:t xml:space="preserve">(2024).</w:t>
-      </w:r>
-    </w:p>
-    <w:bookmarkEnd w:id="83"/>
-    <w:bookmarkStart w:id="85" w:name="ref-hofmann2024dialect"/>
-    <w:p>
-      <w:pPr>
-        <w:pStyle w:val="Bibliography"/>
-      </w:pPr>
-      <w:r>
-        <w:t xml:space="preserve">13.</w:t>
-      </w:r>
-      <w:r>
-        <w:t xml:space="preserve"> </w:t>
-      </w:r>
-      <w:r>
-        <w:t xml:space="preserve">	</w:t>
-      </w:r>
-      <w:r>
         <w:t xml:space="preserve">Hofmann, V., Kalluri, P. R., Jurafsky, D. &amp; King, S.</w:t>
       </w:r>
       <w:r>
         <w:t xml:space="preserve"> </w:t>
       </w:r>
-      <w:hyperlink r:id="rId84">
+      <w:hyperlink r:id="rId86">
         <w:r>
           <w:rPr>
             <w:rStyle w:val="Hyperlink"/>
@@ -4646,8 +4667,8 @@
         <w:t xml:space="preserve">, 147–154 (2024).</w:t>
       </w:r>
     </w:p>
-    <w:bookmarkEnd w:id="85"/>
-    <w:bookmarkStart w:id="87" w:name="ref-rao2024brand"/>
+    <w:bookmarkEnd w:id="87"/>
+    <w:bookmarkStart w:id="89" w:name="ref-rao2024brand"/>
     <w:p>
       <w:pPr>
         <w:pStyle w:val="Bibliography"/>
@@ -4698,7 +4719,7 @@
       <w:r>
         <w:t xml:space="preserve">12695–12702 (2024). doi:</w:t>
       </w:r>
-      <w:hyperlink r:id="rId86">
+      <w:hyperlink r:id="rId88">
         <w:r>
           <w:rPr>
             <w:rStyle w:val="Hyperlink"/>
@@ -4710,8 +4731,8 @@
         <w:t xml:space="preserve">.</w:t>
       </w:r>
     </w:p>
-    <w:bookmarkEnd w:id="87"/>
-    <w:bookmarkStart w:id="89" w:name="ref-santurkar2023whose"/>
+    <w:bookmarkEnd w:id="89"/>
+    <w:bookmarkStart w:id="91" w:name="ref-santurkar2023whose"/>
     <w:p>
       <w:pPr>
         <w:pStyle w:val="Bibliography"/>
@@ -4754,7 +4775,7 @@
       <w:r>
         <w:t xml:space="preserve"> </w:t>
       </w:r>
-      <w:hyperlink r:id="rId88">
+      <w:hyperlink r:id="rId90">
         <w:r>
           <w:rPr>
             <w:rStyle w:val="Hyperlink"/>
@@ -4769,8 +4790,8 @@
         <w:t xml:space="preserve">(2023).</w:t>
       </w:r>
     </w:p>
-    <w:bookmarkEnd w:id="89"/>
-    <w:bookmarkStart w:id="91" w:name="ref-durmus2024globalopinion"/>
+    <w:bookmarkEnd w:id="91"/>
+    <w:bookmarkStart w:id="93" w:name="ref-durmus2024globalopinion"/>
     <w:p>
       <w:pPr>
         <w:pStyle w:val="Bibliography"/>
@@ -4813,7 +4834,7 @@
       <w:r>
         <w:t xml:space="preserve"> </w:t>
       </w:r>
-      <w:hyperlink r:id="rId90">
+      <w:hyperlink r:id="rId92">
         <w:r>
           <w:rPr>
             <w:rStyle w:val="Hyperlink"/>
@@ -4828,8 +4849,8 @@
         <w:t xml:space="preserve">(2024).</w:t>
       </w:r>
     </w:p>
-    <w:bookmarkEnd w:id="91"/>
-    <w:bookmarkStart w:id="93" w:name="ref-abid2021persistent"/>
+    <w:bookmarkEnd w:id="93"/>
+    <w:bookmarkStart w:id="95" w:name="ref-abid2021persistent"/>
     <w:p>
       <w:pPr>
         <w:pStyle w:val="Bibliography"/>
@@ -4868,7 +4889,7 @@
       <w:r>
         <w:t xml:space="preserve"> </w:t>
       </w:r>
-      <w:hyperlink r:id="rId92">
+      <w:hyperlink r:id="rId94">
         <w:r>
           <w:rPr>
             <w:rStyle w:val="Hyperlink"/>
@@ -4883,8 +4904,8 @@
         <w:t xml:space="preserve">(2021).</w:t>
       </w:r>
     </w:p>
-    <w:bookmarkEnd w:id="93"/>
-    <w:bookmarkStart w:id="95" w:name="ref-naous2024cultural"/>
+    <w:bookmarkEnd w:id="95"/>
+    <w:bookmarkStart w:id="97" w:name="ref-naous2024cultural"/>
     <w:p>
       <w:pPr>
         <w:pStyle w:val="Bibliography"/>
@@ -4914,7 +4935,7 @@
       <w:r>
         <w:t xml:space="preserve"> </w:t>
       </w:r>
-      <w:hyperlink r:id="rId94">
+      <w:hyperlink r:id="rId96">
         <w:r>
           <w:rPr>
             <w:rStyle w:val="Hyperlink"/>
@@ -4929,8 +4950,8 @@
         <w:t xml:space="preserve">(2024).</w:t>
       </w:r>
     </w:p>
-    <w:bookmarkEnd w:id="95"/>
-    <w:bookmarkStart w:id="97" w:name="ref-perez2022red"/>
+    <w:bookmarkEnd w:id="97"/>
+    <w:bookmarkStart w:id="99" w:name="ref-perez2022red"/>
     <w:p>
       <w:pPr>
         <w:pStyle w:val="Bibliography"/>
@@ -4973,7 +4994,7 @@
       <w:r>
         <w:t xml:space="preserve"> </w:t>
       </w:r>
-      <w:hyperlink r:id="rId96">
+      <w:hyperlink r:id="rId98">
         <w:r>
           <w:rPr>
             <w:rStyle w:val="Hyperlink"/>
@@ -4988,8 +5009,8 @@
         <w:t xml:space="preserve">(2022).</w:t>
       </w:r>
     </w:p>
-    <w:bookmarkEnd w:id="97"/>
-    <w:bookmarkStart w:id="99" w:name="ref-zou2023universal"/>
+    <w:bookmarkEnd w:id="99"/>
+    <w:bookmarkStart w:id="101" w:name="ref-zou2023universal"/>
     <w:p>
       <w:pPr>
         <w:pStyle w:val="Bibliography"/>
@@ -5032,7 +5053,7 @@
       <w:r>
         <w:t xml:space="preserve"> </w:t>
       </w:r>
-      <w:hyperlink r:id="rId98">
+      <w:hyperlink r:id="rId100">
         <w:r>
           <w:rPr>
             <w:rStyle w:val="Hyperlink"/>
@@ -5047,8 +5068,8 @@
         <w:t xml:space="preserve">(2023).</w:t>
       </w:r>
     </w:p>
-    <w:bookmarkEnd w:id="99"/>
-    <w:bookmarkStart w:id="101" w:name="ref-greshake2023indirect"/>
+    <w:bookmarkEnd w:id="101"/>
+    <w:bookmarkStart w:id="103" w:name="ref-greshake2023indirect"/>
     <w:p>
       <w:pPr>
         <w:pStyle w:val="Bibliography"/>
@@ -5087,7 +5108,7 @@
       <w:r>
         <w:t xml:space="preserve">-integrated applications with indirect prompt injection. 79–90 (2023) doi:</w:t>
       </w:r>
-      <w:hyperlink r:id="rId100">
+      <w:hyperlink r:id="rId102">
         <w:r>
           <w:rPr>
             <w:rStyle w:val="Hyperlink"/>
@@ -5099,8 +5120,8 @@
         <w:t xml:space="preserve">.</w:t>
       </w:r>
     </w:p>
-    <w:bookmarkEnd w:id="101"/>
-    <w:bookmarkStart w:id="103" w:name="ref-liu2023promptinjection"/>
+    <w:bookmarkEnd w:id="103"/>
+    <w:bookmarkStart w:id="105" w:name="ref-liu2023promptinjection"/>
     <w:p>
       <w:pPr>
         <w:pStyle w:val="Bibliography"/>
@@ -5152,7 +5173,7 @@
       <w:r>
         <w:t xml:space="preserve"> </w:t>
       </w:r>
-      <w:hyperlink r:id="rId102">
+      <w:hyperlink r:id="rId104">
         <w:r>
           <w:rPr>
             <w:rStyle w:val="Hyperlink"/>
@@ -5167,8 +5188,8 @@
         <w:t xml:space="preserve">(2023).</w:t>
       </w:r>
     </w:p>
-    <w:bookmarkEnd w:id="103"/>
-    <w:bookmarkStart w:id="105" w:name="ref-arditi2024refusal"/>
+    <w:bookmarkEnd w:id="105"/>
+    <w:bookmarkStart w:id="107" w:name="ref-arditi2024refusal"/>
     <w:p>
       <w:pPr>
         <w:pStyle w:val="Bibliography"/>
@@ -5198,7 +5219,7 @@
       <w:r>
         <w:t xml:space="preserve"> </w:t>
       </w:r>
-      <w:hyperlink r:id="rId104">
+      <w:hyperlink r:id="rId106">
         <w:r>
           <w:rPr>
             <w:rStyle w:val="Hyperlink"/>
@@ -5226,8 +5247,8 @@
         <w:t xml:space="preserve">(2024).</w:t>
       </w:r>
     </w:p>
-    <w:bookmarkEnd w:id="105"/>
-    <w:bookmarkStart w:id="107" w:name="ref-wallace2024instruction"/>
+    <w:bookmarkEnd w:id="107"/>
+    <w:bookmarkStart w:id="109" w:name="ref-wallace2024instruction"/>
     <w:p>
       <w:pPr>
         <w:pStyle w:val="Bibliography"/>
@@ -5270,7 +5291,7 @@
       <w:r>
         <w:t xml:space="preserve"> </w:t>
       </w:r>
-      <w:hyperlink r:id="rId106">
+      <w:hyperlink r:id="rId108">
         <w:r>
           <w:rPr>
             <w:rStyle w:val="Hyperlink"/>
@@ -5285,8 +5306,8 @@
         <w:t xml:space="preserve">(2024).</w:t>
       </w:r>
     </w:p>
-    <w:bookmarkEnd w:id="107"/>
-    <w:bookmarkStart w:id="109" w:name="ref-nisbett1977telling"/>
+    <w:bookmarkEnd w:id="109"/>
+    <w:bookmarkStart w:id="111" w:name="ref-nisbett1977telling"/>
     <w:p>
       <w:pPr>
         <w:pStyle w:val="Bibliography"/>
@@ -5306,7 +5327,7 @@
       <w:r>
         <w:t xml:space="preserve"> </w:t>
       </w:r>
-      <w:hyperlink r:id="rId108">
+      <w:hyperlink r:id="rId110">
         <w:r>
           <w:rPr>
             <w:rStyle w:val="Hyperlink"/>
@@ -5341,8 +5362,8 @@
         <w:t xml:space="preserve">, 231–259 (1977).</w:t>
       </w:r>
     </w:p>
-    <w:bookmarkEnd w:id="109"/>
-    <w:bookmarkStart w:id="111" w:name="ref-greenblatt2024alignment"/>
+    <w:bookmarkEnd w:id="111"/>
+    <w:bookmarkStart w:id="113" w:name="ref-greenblatt2024alignment"/>
     <w:p>
       <w:pPr>
         <w:pStyle w:val="Bibliography"/>
@@ -5385,7 +5406,7 @@
       <w:r>
         <w:t xml:space="preserve"> </w:t>
       </w:r>
-      <w:hyperlink r:id="rId110">
+      <w:hyperlink r:id="rId112">
         <w:r>
           <w:rPr>
             <w:rStyle w:val="Hyperlink"/>
@@ -5400,8 +5421,8 @@
         <w:t xml:space="preserve">(2024).</w:t>
       </w:r>
     </w:p>
-    <w:bookmarkEnd w:id="111"/>
-    <w:bookmarkStart w:id="113" w:name="ref-berglund2023reversal"/>
+    <w:bookmarkEnd w:id="113"/>
+    <w:bookmarkStart w:id="115" w:name="ref-berglund2023reversal"/>
     <w:p>
       <w:pPr>
         <w:pStyle w:val="Bibliography"/>
@@ -5510,7 +5531,7 @@
       <w:r>
         <w:t xml:space="preserve"> </w:t>
       </w:r>
-      <w:hyperlink r:id="rId112">
+      <w:hyperlink r:id="rId114">
         <w:r>
           <w:rPr>
             <w:rStyle w:val="Hyperlink"/>
@@ -5525,8 +5546,8 @@
         <w:t xml:space="preserve">(2024).</w:t>
       </w:r>
     </w:p>
-    <w:bookmarkEnd w:id="113"/>
-    <w:bookmarkStart w:id="115" w:name="ref-wang2025persona"/>
+    <w:bookmarkEnd w:id="115"/>
+    <w:bookmarkStart w:id="117" w:name="ref-wang2025persona"/>
     <w:p>
       <w:pPr>
         <w:pStyle w:val="Bibliography"/>
@@ -5569,7 +5590,7 @@
       <w:r>
         <w:t xml:space="preserve"> </w:t>
       </w:r>
-      <w:hyperlink r:id="rId114">
+      <w:hyperlink r:id="rId116">
         <w:r>
           <w:rPr>
             <w:rStyle w:val="Hyperlink"/>
@@ -5584,8 +5605,8 @@
         <w:t xml:space="preserve">(2025).</w:t>
       </w:r>
     </w:p>
-    <w:bookmarkEnd w:id="115"/>
-    <w:bookmarkStart w:id="117" w:name="ref-turner2025steering"/>
+    <w:bookmarkEnd w:id="117"/>
+    <w:bookmarkStart w:id="119" w:name="ref-turner2025steering"/>
     <w:p>
       <w:pPr>
         <w:pStyle w:val="Bibliography"/>
@@ -5628,7 +5649,7 @@
       <w:r>
         <w:t xml:space="preserve"> </w:t>
       </w:r>
-      <w:hyperlink r:id="rId116">
+      <w:hyperlink r:id="rId118">
         <w:r>
           <w:rPr>
             <w:rStyle w:val="Hyperlink"/>
@@ -5643,8 +5664,8 @@
         <w:t xml:space="preserve">(2025).</w:t>
       </w:r>
     </w:p>
-    <w:bookmarkEnd w:id="117"/>
-    <w:bookmarkStart w:id="119" w:name="ref-chen2025persona"/>
+    <w:bookmarkEnd w:id="119"/>
+    <w:bookmarkStart w:id="121" w:name="ref-chen2025persona"/>
     <w:p>
       <w:pPr>
         <w:pStyle w:val="Bibliography"/>
@@ -5674,7 +5695,7 @@
       <w:r>
         <w:t xml:space="preserve"> </w:t>
       </w:r>
-      <w:hyperlink r:id="rId118">
+      <w:hyperlink r:id="rId120">
         <w:r>
           <w:rPr>
             <w:rStyle w:val="Hyperlink"/>
@@ -5689,8 +5710,8 @@
         <w:t xml:space="preserve">(2025).</w:t>
       </w:r>
     </w:p>
-    <w:bookmarkEnd w:id="119"/>
-    <w:bookmarkStart w:id="121" w:name="ref-soligo2025convergent"/>
+    <w:bookmarkEnd w:id="121"/>
+    <w:bookmarkStart w:id="123" w:name="ref-soligo2025convergent"/>
     <w:p>
       <w:pPr>
         <w:pStyle w:val="Bibliography"/>
@@ -5720,7 +5741,7 @@
       <w:r>
         <w:t xml:space="preserve"> </w:t>
       </w:r>
-      <w:hyperlink r:id="rId120">
+      <w:hyperlink r:id="rId122">
         <w:r>
           <w:rPr>
             <w:rStyle w:val="Hyperlink"/>
@@ -5735,8 +5756,8 @@
         <w:t xml:space="preserve">(2025).</w:t>
       </w:r>
     </w:p>
-    <w:bookmarkEnd w:id="121"/>
-    <w:bookmarkStart w:id="123" w:name="ref-rottger2024political"/>
+    <w:bookmarkEnd w:id="123"/>
+    <w:bookmarkStart w:id="125" w:name="ref-rottger2024political"/>
     <w:p>
       <w:pPr>
         <w:pStyle w:val="Bibliography"/>
@@ -5779,7 +5800,7 @@
       <w:r>
         <w:t xml:space="preserve"> </w:t>
       </w:r>
-      <w:hyperlink r:id="rId122">
+      <w:hyperlink r:id="rId124">
         <w:r>
           <w:rPr>
             <w:rStyle w:val="Hyperlink"/>
@@ -5794,8 +5815,8 @@
         <w:t xml:space="preserve">(2024).</w:t>
       </w:r>
     </w:p>
-    <w:bookmarkEnd w:id="123"/>
-    <w:bookmarkStart w:id="125" w:name="ref-amodei2016concrete"/>
+    <w:bookmarkEnd w:id="125"/>
+    <w:bookmarkStart w:id="127" w:name="ref-amodei2016concrete"/>
     <w:p>
       <w:pPr>
         <w:pStyle w:val="Bibliography"/>
@@ -5850,7 +5871,7 @@
       <w:r>
         <w:t xml:space="preserve"> </w:t>
       </w:r>
-      <w:hyperlink r:id="rId124">
+      <w:hyperlink r:id="rId126">
         <w:r>
           <w:rPr>
             <w:rStyle w:val="Hyperlink"/>
@@ -5865,8 +5886,8 @@
         <w:t xml:space="preserve">(2016).</w:t>
       </w:r>
     </w:p>
-    <w:bookmarkEnd w:id="125"/>
-    <w:bookmarkStart w:id="127" w:name="ref-ngo2024alignment"/>
+    <w:bookmarkEnd w:id="127"/>
+    <w:bookmarkStart w:id="129" w:name="ref-ngo2024alignment"/>
     <w:p>
       <w:pPr>
         <w:pStyle w:val="Bibliography"/>
@@ -5886,7 +5907,7 @@
       <w:r>
         <w:t xml:space="preserve"> </w:t>
       </w:r>
-      <w:hyperlink r:id="rId126">
+      <w:hyperlink r:id="rId128">
         <w:r>
           <w:rPr>
             <w:rStyle w:val="Hyperlink"/>
@@ -5914,8 +5935,8 @@
         <w:t xml:space="preserve">(2024).</w:t>
       </w:r>
     </w:p>
-    <w:bookmarkEnd w:id="127"/>
-    <w:bookmarkStart w:id="129" w:name="ref-zheng2023judging"/>
+    <w:bookmarkEnd w:id="129"/>
+    <w:bookmarkStart w:id="131" w:name="ref-zheng2023judging"/>
     <w:p>
       <w:pPr>
         <w:pStyle w:val="Bibliography"/>
@@ -5976,7 +5997,7 @@
       <w:r>
         <w:t xml:space="preserve"> </w:t>
       </w:r>
-      <w:hyperlink r:id="rId128">
+      <w:hyperlink r:id="rId130">
         <w:r>
           <w:rPr>
             <w:rStyle w:val="Hyperlink"/>
@@ -5991,8 +6012,8 @@
         <w:t xml:space="preserve">(2023).</w:t>
       </w:r>
     </w:p>
-    <w:bookmarkEnd w:id="129"/>
-    <w:bookmarkStart w:id="131" w:name="ref-cohen1960kappa"/>
+    <w:bookmarkEnd w:id="131"/>
+    <w:bookmarkStart w:id="133" w:name="ref-cohen1960kappa"/>
     <w:p>
       <w:pPr>
         <w:pStyle w:val="Bibliography"/>
@@ -6012,7 +6033,7 @@
       <w:r>
         <w:t xml:space="preserve"> </w:t>
       </w:r>
-      <w:hyperlink r:id="rId130">
+      <w:hyperlink r:id="rId132">
         <w:r>
           <w:rPr>
             <w:rStyle w:val="Hyperlink"/>
@@ -6047,8 +6068,8 @@
         <w:t xml:space="preserve">, 37–46 (1960).</w:t>
       </w:r>
     </w:p>
-    <w:bookmarkEnd w:id="131"/>
-    <w:bookmarkStart w:id="133" w:name="ref-wilson1927confidence"/>
+    <w:bookmarkEnd w:id="133"/>
+    <w:bookmarkStart w:id="135" w:name="ref-wilson1927confidence"/>
     <w:p>
       <w:pPr>
         <w:pStyle w:val="Bibliography"/>
@@ -6068,7 +6089,7 @@
       <w:r>
         <w:t xml:space="preserve"> </w:t>
       </w:r>
-      <w:hyperlink r:id="rId132">
+      <w:hyperlink r:id="rId134">
         <w:r>
           <w:rPr>
             <w:rStyle w:val="Hyperlink"/>
@@ -6103,9 +6124,9 @@
         <w:t xml:space="preserve">, 209–212 (1927).</w:t>
       </w:r>
     </w:p>
-    <w:bookmarkEnd w:id="133"/>
-    <w:bookmarkEnd w:id="134"/>
     <w:bookmarkEnd w:id="135"/>
+    <w:bookmarkEnd w:id="136"/>
+    <w:bookmarkEnd w:id="137"/>
     <w:sectPr>
       <w:pgSz w:h="15840" w:w="12240"/>
       <w:pgMar w:bottom="1440" w:footer="720" w:gutter="0" w:header="720" w:left="1440" w:right="1440" w:top="1440"/>

</xml_diff>